<commit_message>
Day 13: deepen Materi to the plan's Wissen (rule 2.17) with real findings
All 12 Wissen topics are now full: ADHD and autism prevalence, WCAG 2.2.1, 2.2.2, 2.3.3, 3.2.3,
3.2.4, 3.3.2, 3.3.7 and 3.3.8, the 48-reader font study, the five-user rule and the W3C cognitive
accessibility guidance. Day 13 added to verify:depth; Word documents of Day 13 rebuilt.

Co-Authored-By: Claude Sonnet 5.5 <noreply@anthropic.com>
</commit_message>
<xml_diff>
--- a/docx/Day13-Materi-AION-UX-Developer-Neurodiversity-inclusive-patterns-and-assistive-technologies.docx
+++ b/docx/Day13-Materi-AION-UX-Developer-Neurodiversity-inclusive-patterns-and-assistive-technologies.docx
@@ -2724,6 +2724,319 @@
         <w:spacing w:before="0" w:after="80"/>
       </w:pPr>
     </w:p>
+    <w:p>
+      <w:pPr>
+        <w:spacing w:before="0" w:after="100"/>
+      </w:pPr>
+      <w:r>
+        <w:rPr>
+          <w:b/>
+        </w:rPr>
+        <w:t>Different minds, different loads: how many people, and what the guidance says</w:t>
+      </w:r>
+    </w:p>
+    <w:tbl>
+      <w:tblPr>
+        <w:tblW w:w="9638" w:type="dxa"/>
+        <w:tblBorders>
+          <w:top w:val="single" w:sz="4" w:space="0" w:color="D5DEE9"/>
+          <w:left w:val="single" w:sz="4" w:space="0" w:color="D5DEE9"/>
+          <w:bottom w:val="single" w:sz="4" w:space="0" w:color="D5DEE9"/>
+          <w:right w:val="single" w:sz="4" w:space="0" w:color="D5DEE9"/>
+          <w:insideH w:val="single" w:sz="4" w:space="0" w:color="D5DEE9"/>
+          <w:insideV w:val="single" w:sz="4" w:space="0" w:color="D5DEE9"/>
+        </w:tblBorders>
+        <w:tblLayout w:type="fixed"/>
+        <w:tblCellMar>
+          <w:top w:w="60" w:type="dxa"/>
+          <w:left w:w="100" w:type="dxa"/>
+          <w:bottom w:w="60" w:type="dxa"/>
+          <w:right w:w="100" w:type="dxa"/>
+        </w:tblCellMar>
+      </w:tblPr>
+      <w:tblGrid>
+        <w:gridCol w:w="1342"/>
+        <w:gridCol w:w="4746"/>
+        <w:gridCol w:w="3550"/>
+      </w:tblGrid>
+      <w:tr>
+        <w:trPr>
+          <w:cantSplit/>
+          <w:tblHeader/>
+        </w:trPr>
+        <w:tc>
+          <w:tcPr>
+            <w:tcW w:type="dxa" w:w="1342"/>
+            <w:shd w:val="clear" w:color="auto" w:fill="E6ECF4"/>
+          </w:tcPr>
+          <w:p>
+            <w:pPr>
+              <w:spacing w:before="0" w:after="0"/>
+            </w:pPr>
+            <w:r>
+              <w:rPr>
+                <w:b/>
+                <w:sz w:val="20"/>
+              </w:rPr>
+              <w:t>Topic</w:t>
+            </w:r>
+          </w:p>
+        </w:tc>
+        <w:tc>
+          <w:tcPr>
+            <w:tcW w:type="dxa" w:w="4746"/>
+            <w:shd w:val="clear" w:color="auto" w:fill="E6ECF4"/>
+          </w:tcPr>
+          <w:p>
+            <w:pPr>
+              <w:spacing w:before="0" w:after="0"/>
+            </w:pPr>
+            <w:r>
+              <w:rPr>
+                <w:b/>
+                <w:sz w:val="20"/>
+              </w:rPr>
+              <w:t>Real finding</w:t>
+            </w:r>
+          </w:p>
+        </w:tc>
+        <w:tc>
+          <w:tcPr>
+            <w:tcW w:type="dxa" w:w="3550"/>
+            <w:shd w:val="clear" w:color="auto" w:fill="E6ECF4"/>
+          </w:tcPr>
+          <w:p>
+            <w:pPr>
+              <w:spacing w:before="0" w:after="0"/>
+            </w:pPr>
+            <w:r>
+              <w:rPr>
+                <w:b/>
+                <w:sz w:val="20"/>
+              </w:rPr>
+              <w:t>What it means for a screen</w:t>
+            </w:r>
+          </w:p>
+        </w:tc>
+      </w:tr>
+      <w:tr>
+        <w:trPr>
+          <w:cantSplit/>
+        </w:trPr>
+        <w:tc>
+          <w:tcPr>
+            <w:tcW w:type="dxa" w:w="1342"/>
+          </w:tcPr>
+          <w:p>
+            <w:pPr>
+              <w:spacing w:before="0" w:after="0"/>
+            </w:pPr>
+            <w:r>
+              <w:rPr>
+                <w:sz w:val="20"/>
+              </w:rPr>
+              <w:t>ADHD</w:t>
+            </w:r>
+          </w:p>
+        </w:tc>
+        <w:tc>
+          <w:tcPr>
+            <w:tcW w:type="dxa" w:w="4746"/>
+          </w:tcPr>
+          <w:p>
+            <w:pPr>
+              <w:spacing w:before="0" w:after="0"/>
+            </w:pPr>
+            <w:r>
+              <w:rPr>
+                <w:sz w:val="20"/>
+              </w:rPr>
+              <w:t>A review of 102 studies with 171,756 children and adolescents found a pooled worldwide prevalence of ADHD of 5.29% (Polanczyk et al. 2007).</w:t>
+            </w:r>
+          </w:p>
+        </w:tc>
+        <w:tc>
+          <w:tcPr>
+            <w:tcW w:type="dxa" w:w="3550"/>
+          </w:tcPr>
+          <w:p>
+            <w:pPr>
+              <w:spacing w:before="0" w:after="0"/>
+            </w:pPr>
+            <w:r>
+              <w:rPr>
+                <w:sz w:val="20"/>
+              </w:rPr>
+              <w:t>Distraction-prone users are in every audience: a quiet default serves them and everyone else.</w:t>
+            </w:r>
+          </w:p>
+        </w:tc>
+      </w:tr>
+      <w:tr>
+        <w:trPr>
+          <w:cantSplit/>
+        </w:trPr>
+        <w:tc>
+          <w:tcPr>
+            <w:tcW w:type="dxa" w:w="1342"/>
+          </w:tcPr>
+          <w:p>
+            <w:pPr>
+              <w:spacing w:before="0" w:after="0"/>
+            </w:pPr>
+            <w:r>
+              <w:rPr>
+                <w:sz w:val="20"/>
+              </w:rPr>
+              <w:t>Autism</w:t>
+            </w:r>
+          </w:p>
+        </w:tc>
+        <w:tc>
+          <w:tcPr>
+            <w:tcW w:type="dxa" w:w="4746"/>
+          </w:tcPr>
+          <w:p>
+            <w:pPr>
+              <w:spacing w:before="0" w:after="0"/>
+            </w:pPr>
+            <w:r>
+              <w:rPr>
+                <w:sz w:val="20"/>
+              </w:rPr>
+              <w:t>About one in 100 children has autism, as an average estimate with large differences between studies (World Health Organization 2022).</w:t>
+            </w:r>
+          </w:p>
+        </w:tc>
+        <w:tc>
+          <w:tcPr>
+            <w:tcW w:type="dxa" w:w="3550"/>
+          </w:tcPr>
+          <w:p>
+            <w:pPr>
+              <w:spacing w:before="0" w:after="0"/>
+            </w:pPr>
+            <w:r>
+              <w:rPr>
+                <w:sz w:val="20"/>
+              </w:rPr>
+              <w:t>A predictable, literal interface is not a special case.</w:t>
+            </w:r>
+          </w:p>
+        </w:tc>
+      </w:tr>
+      <w:tr>
+        <w:trPr>
+          <w:cantSplit/>
+        </w:trPr>
+        <w:tc>
+          <w:tcPr>
+            <w:tcW w:type="dxa" w:w="1342"/>
+          </w:tcPr>
+          <w:p>
+            <w:pPr>
+              <w:spacing w:before="0" w:after="0"/>
+            </w:pPr>
+            <w:r>
+              <w:rPr>
+                <w:sz w:val="20"/>
+              </w:rPr>
+              <w:t>Dyslexia</w:t>
+            </w:r>
+          </w:p>
+        </w:tc>
+        <w:tc>
+          <w:tcPr>
+            <w:tcW w:type="dxa" w:w="4746"/>
+          </w:tcPr>
+          <w:p>
+            <w:pPr>
+              <w:spacing w:before="0" w:after="0"/>
+            </w:pPr>
+            <w:r>
+              <w:rPr>
+                <w:sz w:val="20"/>
+              </w:rPr>
+              <w:t>How many people have dyslexia depends on the definition and is best seen as a continuum; the often-quoted 10% has no traceable source (Dyslexia Action).</w:t>
+            </w:r>
+          </w:p>
+        </w:tc>
+        <w:tc>
+          <w:tcPr>
+            <w:tcW w:type="dxa" w:w="3550"/>
+          </w:tcPr>
+          <w:p>
+            <w:pPr>
+              <w:spacing w:before="0" w:after="0"/>
+            </w:pPr>
+            <w:r>
+              <w:rPr>
+                <w:sz w:val="20"/>
+              </w:rPr>
+              <w:t>Design for a range of reading ability, not for a label.</w:t>
+            </w:r>
+          </w:p>
+        </w:tc>
+      </w:tr>
+      <w:tr>
+        <w:trPr>
+          <w:cantSplit/>
+        </w:trPr>
+        <w:tc>
+          <w:tcPr>
+            <w:tcW w:type="dxa" w:w="1342"/>
+          </w:tcPr>
+          <w:p>
+            <w:pPr>
+              <w:spacing w:before="0" w:after="0"/>
+            </w:pPr>
+            <w:r>
+              <w:rPr>
+                <w:sz w:val="20"/>
+              </w:rPr>
+              <w:t>Where the guidance comes from</w:t>
+            </w:r>
+          </w:p>
+        </w:tc>
+        <w:tc>
+          <w:tcPr>
+            <w:tcW w:type="dxa" w:w="4746"/>
+          </w:tcPr>
+          <w:p>
+            <w:pPr>
+              <w:spacing w:before="0" w:after="0"/>
+            </w:pPr>
+            <w:r>
+              <w:rPr>
+                <w:sz w:val="20"/>
+              </w:rPr>
+              <w:t>The W3C working group on cognitive accessibility publishes objectives and patterns as supplemental guidance beyond WCAG; following it is not required for WCAG conformance (W3C COGA 2021).</w:t>
+            </w:r>
+          </w:p>
+        </w:tc>
+        <w:tc>
+          <w:tcPr>
+            <w:tcW w:type="dxa" w:w="3550"/>
+          </w:tcPr>
+          <w:p>
+            <w:pPr>
+              <w:spacing w:before="0" w:after="0"/>
+            </w:pPr>
+            <w:r>
+              <w:rPr>
+                <w:sz w:val="20"/>
+              </w:rPr>
+              <w:t>Use the patterns as a design toolkit and test them; do not claim conformance from them.</w:t>
+            </w:r>
+          </w:p>
+        </w:tc>
+      </w:tr>
+    </w:tbl>
+    <w:p>
+      <w:pPr>
+        <w:spacing w:before="0" w:after="80"/>
+      </w:pPr>
+    </w:p>
     <w:tbl>
       <w:tblPr>
         <w:tblW w:w="9598" w:type="dxa"/>
@@ -2773,7 +3086,7 @@
             </w:pPr>
             <w:r>
               <w:rPr/>
-              <w:t>Hearth Energy, Ayo, Mirko, Tilda, Pia and Lukas are made up for this example. The load factors are the ones the plan names; ADHD as a difference in attention and executive function follows Barkley (2015); the dos and don'ts follow the Home Office posters (Pun 2016) and the British Dyslexia Association (2023).</w:t>
+              <w:t>Hearth Energy, Ayo, Mirko, Tilda, Pia and Lukas are made up for this example. The load factors are the ones the plan names; ADHD as a difference in attention and executive function follows Barkley (2015); the dos and don'ts follow the Home Office posters (Pun 2016) and the British Dyslexia Association (2023). The findings in the table of real evidence are real research results, rules and cases; the sources are listed below.</w:t>
             </w:r>
           </w:p>
         </w:tc>
@@ -2962,7 +3275,7 @@
           <w:color w:val="556274"/>
           <w:sz w:val="18"/>
         </w:rPr>
-        <w:t>Barkley 2015 · Pun 2016 · British Dyslexia Association 2023</w:t>
+        <w:t>Barkley 2015 · Pun 2016 · British Dyslexia Association 2023 · Polanczyk et al. 2007 · WHO autism fact sheet · Dyslexia Action · W3C COGA 2021</w:t>
       </w:r>
     </w:p>
     <w:p>
@@ -3197,6 +3510,319 @@
         <w:t>Figure 3 · Moving house at Hearth Energy as one long form or as three steps. Shown here in its starting state; in the Neuro-UX Lab every version and every stress test can be used.</w:t>
       </w:r>
     </w:p>
+    <w:p>
+      <w:pPr>
+        <w:spacing w:before="0" w:after="100"/>
+      </w:pPr>
+      <w:r>
+        <w:rPr>
+          <w:b/>
+        </w:rPr>
+        <w:t>Stimuli and focus: rules</w:t>
+      </w:r>
+    </w:p>
+    <w:tbl>
+      <w:tblPr>
+        <w:tblW w:w="9638" w:type="dxa"/>
+        <w:tblBorders>
+          <w:top w:val="single" w:sz="4" w:space="0" w:color="D5DEE9"/>
+          <w:left w:val="single" w:sz="4" w:space="0" w:color="D5DEE9"/>
+          <w:bottom w:val="single" w:sz="4" w:space="0" w:color="D5DEE9"/>
+          <w:right w:val="single" w:sz="4" w:space="0" w:color="D5DEE9"/>
+          <w:insideH w:val="single" w:sz="4" w:space="0" w:color="D5DEE9"/>
+          <w:insideV w:val="single" w:sz="4" w:space="0" w:color="D5DEE9"/>
+        </w:tblBorders>
+        <w:tblLayout w:type="fixed"/>
+        <w:tblCellMar>
+          <w:top w:w="60" w:type="dxa"/>
+          <w:left w:w="100" w:type="dxa"/>
+          <w:bottom w:w="60" w:type="dxa"/>
+          <w:right w:w="100" w:type="dxa"/>
+        </w:tblCellMar>
+      </w:tblPr>
+      <w:tblGrid>
+        <w:gridCol w:w="1483"/>
+        <w:gridCol w:w="5423"/>
+        <w:gridCol w:w="2732"/>
+      </w:tblGrid>
+      <w:tr>
+        <w:trPr>
+          <w:cantSplit/>
+          <w:tblHeader/>
+        </w:trPr>
+        <w:tc>
+          <w:tcPr>
+            <w:tcW w:type="dxa" w:w="1483"/>
+            <w:shd w:val="clear" w:color="auto" w:fill="E6ECF4"/>
+          </w:tcPr>
+          <w:p>
+            <w:pPr>
+              <w:spacing w:before="0" w:after="0"/>
+            </w:pPr>
+            <w:r>
+              <w:rPr>
+                <w:b/>
+                <w:sz w:val="20"/>
+              </w:rPr>
+              <w:t>Topic</w:t>
+            </w:r>
+          </w:p>
+        </w:tc>
+        <w:tc>
+          <w:tcPr>
+            <w:tcW w:type="dxa" w:w="5423"/>
+            <w:shd w:val="clear" w:color="auto" w:fill="E6ECF4"/>
+          </w:tcPr>
+          <w:p>
+            <w:pPr>
+              <w:spacing w:before="0" w:after="0"/>
+            </w:pPr>
+            <w:r>
+              <w:rPr>
+                <w:b/>
+                <w:sz w:val="20"/>
+              </w:rPr>
+              <w:t>Real rule</w:t>
+            </w:r>
+          </w:p>
+        </w:tc>
+        <w:tc>
+          <w:tcPr>
+            <w:tcW w:type="dxa" w:w="2732"/>
+            <w:shd w:val="clear" w:color="auto" w:fill="E6ECF4"/>
+          </w:tcPr>
+          <w:p>
+            <w:pPr>
+              <w:spacing w:before="0" w:after="0"/>
+            </w:pPr>
+            <w:r>
+              <w:rPr>
+                <w:b/>
+                <w:sz w:val="20"/>
+              </w:rPr>
+              <w:t>What it means for a screen</w:t>
+            </w:r>
+          </w:p>
+        </w:tc>
+      </w:tr>
+      <w:tr>
+        <w:trPr>
+          <w:cantSplit/>
+        </w:trPr>
+        <w:tc>
+          <w:tcPr>
+            <w:tcW w:type="dxa" w:w="1483"/>
+          </w:tcPr>
+          <w:p>
+            <w:pPr>
+              <w:spacing w:before="0" w:after="0"/>
+            </w:pPr>
+            <w:r>
+              <w:rPr>
+                <w:sz w:val="20"/>
+              </w:rPr>
+              <w:t>Moving content</w:t>
+            </w:r>
+          </w:p>
+        </w:tc>
+        <w:tc>
+          <w:tcPr>
+            <w:tcW w:type="dxa" w:w="5423"/>
+          </w:tcPr>
+          <w:p>
+            <w:pPr>
+              <w:spacing w:before="0" w:after="0"/>
+            </w:pPr>
+            <w:r>
+              <w:rPr>
+                <w:sz w:val="20"/>
+              </w:rPr>
+              <w:t>Content that moves, blinks or scrolls, starts automatically and lasts more than five seconds must have a mechanism to pause, stop or hide it (WCAG 2.2.2).</w:t>
+            </w:r>
+          </w:p>
+        </w:tc>
+        <w:tc>
+          <w:tcPr>
+            <w:tcW w:type="dxa" w:w="2732"/>
+          </w:tcPr>
+          <w:p>
+            <w:pPr>
+              <w:spacing w:before="0" w:after="0"/>
+            </w:pPr>
+            <w:r>
+              <w:rPr>
+                <w:sz w:val="20"/>
+              </w:rPr>
+              <w:t>No auto-playing carousels, tickers or animated backgrounds without a stop.</w:t>
+            </w:r>
+          </w:p>
+        </w:tc>
+      </w:tr>
+      <w:tr>
+        <w:trPr>
+          <w:cantSplit/>
+        </w:trPr>
+        <w:tc>
+          <w:tcPr>
+            <w:tcW w:type="dxa" w:w="1483"/>
+          </w:tcPr>
+          <w:p>
+            <w:pPr>
+              <w:spacing w:before="0" w:after="0"/>
+            </w:pPr>
+            <w:r>
+              <w:rPr>
+                <w:sz w:val="20"/>
+              </w:rPr>
+              <w:t>Timing</w:t>
+            </w:r>
+          </w:p>
+        </w:tc>
+        <w:tc>
+          <w:tcPr>
+            <w:tcW w:type="dxa" w:w="5423"/>
+          </w:tcPr>
+          <w:p>
+            <w:pPr>
+              <w:spacing w:before="0" w:after="0"/>
+            </w:pPr>
+            <w:r>
+              <w:rPr>
+                <w:sz w:val="20"/>
+              </w:rPr>
+              <w:t>Where a time limit is set, users must be able to turn it off, adjust it or extend it (WCAG 2.2.1).</w:t>
+            </w:r>
+          </w:p>
+        </w:tc>
+        <w:tc>
+          <w:tcPr>
+            <w:tcW w:type="dxa" w:w="2732"/>
+          </w:tcPr>
+          <w:p>
+            <w:pPr>
+              <w:spacing w:before="0" w:after="0"/>
+            </w:pPr>
+            <w:r>
+              <w:rPr>
+                <w:sz w:val="20"/>
+              </w:rPr>
+              <w:t>Do not rush a task that needs thought.</w:t>
+            </w:r>
+          </w:p>
+        </w:tc>
+      </w:tr>
+      <w:tr>
+        <w:trPr>
+          <w:cantSplit/>
+        </w:trPr>
+        <w:tc>
+          <w:tcPr>
+            <w:tcW w:type="dxa" w:w="1483"/>
+          </w:tcPr>
+          <w:p>
+            <w:pPr>
+              <w:spacing w:before="0" w:after="0"/>
+            </w:pPr>
+            <w:r>
+              <w:rPr>
+                <w:sz w:val="20"/>
+              </w:rPr>
+              <w:t>Motion on request</w:t>
+            </w:r>
+          </w:p>
+        </w:tc>
+        <w:tc>
+          <w:tcPr>
+            <w:tcW w:type="dxa" w:w="5423"/>
+          </w:tcPr>
+          <w:p>
+            <w:pPr>
+              <w:spacing w:before="0" w:after="0"/>
+            </w:pPr>
+            <w:r>
+              <w:rPr>
+                <w:sz w:val="20"/>
+              </w:rPr>
+              <w:t>Browsers pass on the user's setting for reduced motion (the prefers-reduced-motion media feature), and WCAG 2.3.3 asks that motion triggered by interaction can be disabled (level AAA).</w:t>
+            </w:r>
+          </w:p>
+        </w:tc>
+        <w:tc>
+          <w:tcPr>
+            <w:tcW w:type="dxa" w:w="2732"/>
+          </w:tcPr>
+          <w:p>
+            <w:pPr>
+              <w:spacing w:before="0" w:after="0"/>
+            </w:pPr>
+            <w:r>
+              <w:rPr>
+                <w:sz w:val="20"/>
+              </w:rPr>
+              <w:t>Respect the setting: calm by choice, lively by choice.</w:t>
+            </w:r>
+          </w:p>
+        </w:tc>
+      </w:tr>
+      <w:tr>
+        <w:trPr>
+          <w:cantSplit/>
+        </w:trPr>
+        <w:tc>
+          <w:tcPr>
+            <w:tcW w:type="dxa" w:w="1483"/>
+          </w:tcPr>
+          <w:p>
+            <w:pPr>
+              <w:spacing w:before="0" w:after="0"/>
+            </w:pPr>
+            <w:r>
+              <w:rPr>
+                <w:sz w:val="20"/>
+              </w:rPr>
+              <w:t>Redundant entry</w:t>
+            </w:r>
+          </w:p>
+        </w:tc>
+        <w:tc>
+          <w:tcPr>
+            <w:tcW w:type="dxa" w:w="5423"/>
+          </w:tcPr>
+          <w:p>
+            <w:pPr>
+              <w:spacing w:before="0" w:after="0"/>
+            </w:pPr>
+            <w:r>
+              <w:rPr>
+                <w:sz w:val="20"/>
+              </w:rPr>
+              <w:t>WCAG 2.2 asks that information a user already gave in the same process is not asked for again (3.3.7).</w:t>
+            </w:r>
+          </w:p>
+        </w:tc>
+        <w:tc>
+          <w:tcPr>
+            <w:tcW w:type="dxa" w:w="2732"/>
+          </w:tcPr>
+          <w:p>
+            <w:pPr>
+              <w:spacing w:before="0" w:after="0"/>
+            </w:pPr>
+            <w:r>
+              <w:rPr>
+                <w:sz w:val="20"/>
+              </w:rPr>
+              <w:t>Carry data across steps: it spares the memory and the patience.</w:t>
+            </w:r>
+          </w:p>
+        </w:tc>
+      </w:tr>
+    </w:tbl>
+    <w:p>
+      <w:pPr>
+        <w:spacing w:before="0" w:after="80"/>
+      </w:pPr>
+    </w:p>
     <w:tbl>
       <w:tblPr>
         <w:tblW w:w="9598" w:type="dxa"/>
@@ -3246,7 +3872,7 @@
             </w:pPr>
             <w:r>
               <w:rPr/>
-              <w:t>Hearth Energy, Ayo, Mirko, Tilda, Pia and Lukas are made up for this example. Limiting interruptions, avoiding too much content and five or fewer main choices per screen follow the W3C's “Making Content Usable” (2021).</w:t>
+              <w:t>Hearth Energy, Ayo, Mirko, Tilda, Pia and Lukas are made up for this example. Limiting interruptions, avoiding too much content and five or fewer main choices per screen follow the W3C's “Making Content Usable” (2021). The findings in the table of real evidence are real research results, rules and cases; the sources are listed below.</w:t>
             </w:r>
           </w:p>
         </w:tc>
@@ -3435,7 +4061,7 @@
           <w:color w:val="556274"/>
           <w:sz w:val="18"/>
         </w:rPr>
-        <w:t>W3C COGA 2021 · Barkley 2015</w:t>
+        <w:t>W3C COGA 2021 · Barkley 2015 · WCAG 2.2</w:t>
       </w:r>
     </w:p>
     <w:p>
@@ -3928,6 +4554,319 @@
         <w:spacing w:before="0" w:after="80"/>
       </w:pPr>
     </w:p>
+    <w:p>
+      <w:pPr>
+        <w:spacing w:before="0" w:after="100"/>
+      </w:pPr>
+      <w:r>
+        <w:rPr>
+          <w:b/>
+        </w:rPr>
+        <w:t>Predictability and literal words: rules and guidance</w:t>
+      </w:r>
+    </w:p>
+    <w:tbl>
+      <w:tblPr>
+        <w:tblW w:w="9638" w:type="dxa"/>
+        <w:tblBorders>
+          <w:top w:val="single" w:sz="4" w:space="0" w:color="D5DEE9"/>
+          <w:left w:val="single" w:sz="4" w:space="0" w:color="D5DEE9"/>
+          <w:bottom w:val="single" w:sz="4" w:space="0" w:color="D5DEE9"/>
+          <w:right w:val="single" w:sz="4" w:space="0" w:color="D5DEE9"/>
+          <w:insideH w:val="single" w:sz="4" w:space="0" w:color="D5DEE9"/>
+          <w:insideV w:val="single" w:sz="4" w:space="0" w:color="D5DEE9"/>
+        </w:tblBorders>
+        <w:tblLayout w:type="fixed"/>
+        <w:tblCellMar>
+          <w:top w:w="60" w:type="dxa"/>
+          <w:left w:w="100" w:type="dxa"/>
+          <w:bottom w:w="60" w:type="dxa"/>
+          <w:right w:w="100" w:type="dxa"/>
+        </w:tblCellMar>
+      </w:tblPr>
+      <w:tblGrid>
+        <w:gridCol w:w="1952"/>
+        <w:gridCol w:w="4732"/>
+        <w:gridCol w:w="2954"/>
+      </w:tblGrid>
+      <w:tr>
+        <w:trPr>
+          <w:cantSplit/>
+          <w:tblHeader/>
+        </w:trPr>
+        <w:tc>
+          <w:tcPr>
+            <w:tcW w:type="dxa" w:w="1952"/>
+            <w:shd w:val="clear" w:color="auto" w:fill="E6ECF4"/>
+          </w:tcPr>
+          <w:p>
+            <w:pPr>
+              <w:spacing w:before="0" w:after="0"/>
+            </w:pPr>
+            <w:r>
+              <w:rPr>
+                <w:b/>
+                <w:sz w:val="20"/>
+              </w:rPr>
+              <w:t>Topic</w:t>
+            </w:r>
+          </w:p>
+        </w:tc>
+        <w:tc>
+          <w:tcPr>
+            <w:tcW w:type="dxa" w:w="4732"/>
+            <w:shd w:val="clear" w:color="auto" w:fill="E6ECF4"/>
+          </w:tcPr>
+          <w:p>
+            <w:pPr>
+              <w:spacing w:before="0" w:after="0"/>
+            </w:pPr>
+            <w:r>
+              <w:rPr>
+                <w:b/>
+                <w:sz w:val="20"/>
+              </w:rPr>
+              <w:t>Real rule or guidance</w:t>
+            </w:r>
+          </w:p>
+        </w:tc>
+        <w:tc>
+          <w:tcPr>
+            <w:tcW w:type="dxa" w:w="2954"/>
+            <w:shd w:val="clear" w:color="auto" w:fill="E6ECF4"/>
+          </w:tcPr>
+          <w:p>
+            <w:pPr>
+              <w:spacing w:before="0" w:after="0"/>
+            </w:pPr>
+            <w:r>
+              <w:rPr>
+                <w:b/>
+                <w:sz w:val="20"/>
+              </w:rPr>
+              <w:t>What it means for a screen</w:t>
+            </w:r>
+          </w:p>
+        </w:tc>
+      </w:tr>
+      <w:tr>
+        <w:trPr>
+          <w:cantSplit/>
+        </w:trPr>
+        <w:tc>
+          <w:tcPr>
+            <w:tcW w:type="dxa" w:w="1952"/>
+          </w:tcPr>
+          <w:p>
+            <w:pPr>
+              <w:spacing w:before="0" w:after="0"/>
+            </w:pPr>
+            <w:r>
+              <w:rPr>
+                <w:sz w:val="20"/>
+              </w:rPr>
+              <w:t>Consistent navigation</w:t>
+            </w:r>
+          </w:p>
+        </w:tc>
+        <w:tc>
+          <w:tcPr>
+            <w:tcW w:type="dxa" w:w="4732"/>
+          </w:tcPr>
+          <w:p>
+            <w:pPr>
+              <w:spacing w:before="0" w:after="0"/>
+            </w:pPr>
+            <w:r>
+              <w:rPr>
+                <w:sz w:val="20"/>
+              </w:rPr>
+              <w:t>Navigation that repeats on several pages must keep the same relative order (WCAG 3.2.3), and components with the same function must be identified consistently (3.2.4).</w:t>
+            </w:r>
+          </w:p>
+        </w:tc>
+        <w:tc>
+          <w:tcPr>
+            <w:tcW w:type="dxa" w:w="2954"/>
+          </w:tcPr>
+          <w:p>
+            <w:pPr>
+              <w:spacing w:before="0" w:after="0"/>
+            </w:pPr>
+            <w:r>
+              <w:rPr>
+                <w:sz w:val="20"/>
+              </w:rPr>
+              <w:t>Keep the same pattern in the same place on every page.</w:t>
+            </w:r>
+          </w:p>
+        </w:tc>
+      </w:tr>
+      <w:tr>
+        <w:trPr>
+          <w:cantSplit/>
+        </w:trPr>
+        <w:tc>
+          <w:tcPr>
+            <w:tcW w:type="dxa" w:w="1952"/>
+          </w:tcPr>
+          <w:p>
+            <w:pPr>
+              <w:spacing w:before="0" w:after="0"/>
+            </w:pPr>
+            <w:r>
+              <w:rPr>
+                <w:sz w:val="20"/>
+              </w:rPr>
+              <w:t>Labels and instructions</w:t>
+            </w:r>
+          </w:p>
+        </w:tc>
+        <w:tc>
+          <w:tcPr>
+            <w:tcW w:type="dxa" w:w="4732"/>
+          </w:tcPr>
+          <w:p>
+            <w:pPr>
+              <w:spacing w:before="0" w:after="0"/>
+            </w:pPr>
+            <w:r>
+              <w:rPr>
+                <w:sz w:val="20"/>
+              </w:rPr>
+              <w:t>Labels or instructions must be provided where content asks for user input (WCAG 3.3.2).</w:t>
+            </w:r>
+          </w:p>
+        </w:tc>
+        <w:tc>
+          <w:tcPr>
+            <w:tcW w:type="dxa" w:w="2954"/>
+          </w:tcPr>
+          <w:p>
+            <w:pPr>
+              <w:spacing w:before="0" w:after="0"/>
+            </w:pPr>
+            <w:r>
+              <w:rPr>
+                <w:sz w:val="20"/>
+              </w:rPr>
+              <w:t>Say what is asked and in what format, before the person types.</w:t>
+            </w:r>
+          </w:p>
+        </w:tc>
+      </w:tr>
+      <w:tr>
+        <w:trPr>
+          <w:cantSplit/>
+        </w:trPr>
+        <w:tc>
+          <w:tcPr>
+            <w:tcW w:type="dxa" w:w="1952"/>
+          </w:tcPr>
+          <w:p>
+            <w:pPr>
+              <w:spacing w:before="0" w:after="0"/>
+            </w:pPr>
+            <w:r>
+              <w:rPr>
+                <w:sz w:val="20"/>
+              </w:rPr>
+              <w:t>Understand and find</w:t>
+            </w:r>
+          </w:p>
+        </w:tc>
+        <w:tc>
+          <w:tcPr>
+            <w:tcW w:type="dxa" w:w="4732"/>
+          </w:tcPr>
+          <w:p>
+            <w:pPr>
+              <w:spacing w:before="0" w:after="0"/>
+            </w:pPr>
+            <w:r>
+              <w:rPr>
+                <w:sz w:val="20"/>
+              </w:rPr>
+              <w:t>Among the objectives of the cognitive accessibility guidance are helping users understand what things are and how to use them, and helping users find what they need (W3C COGA 2021).</w:t>
+            </w:r>
+          </w:p>
+        </w:tc>
+        <w:tc>
+          <w:tcPr>
+            <w:tcW w:type="dxa" w:w="2954"/>
+          </w:tcPr>
+          <w:p>
+            <w:pPr>
+              <w:spacing w:before="0" w:after="0"/>
+            </w:pPr>
+            <w:r>
+              <w:rPr>
+                <w:sz w:val="20"/>
+              </w:rPr>
+              <w:t>Use literal, descriptive words; avoid idioms and jokes in instructions.</w:t>
+            </w:r>
+          </w:p>
+        </w:tc>
+      </w:tr>
+      <w:tr>
+        <w:trPr>
+          <w:cantSplit/>
+        </w:trPr>
+        <w:tc>
+          <w:tcPr>
+            <w:tcW w:type="dxa" w:w="1952"/>
+          </w:tcPr>
+          <w:p>
+            <w:pPr>
+              <w:spacing w:before="0" w:after="0"/>
+            </w:pPr>
+            <w:r>
+              <w:rPr>
+                <w:sz w:val="20"/>
+              </w:rPr>
+              <w:t>Unusual words</w:t>
+            </w:r>
+          </w:p>
+        </w:tc>
+        <w:tc>
+          <w:tcPr>
+            <w:tcW w:type="dxa" w:w="4732"/>
+          </w:tcPr>
+          <w:p>
+            <w:pPr>
+              <w:spacing w:before="0" w:after="0"/>
+            </w:pPr>
+            <w:r>
+              <w:rPr>
+                <w:sz w:val="20"/>
+              </w:rPr>
+              <w:t>WCAG asks at its highest level that a mechanism is available for finding the meaning of unusual words, idioms and jargon (3.1.3).</w:t>
+            </w:r>
+          </w:p>
+        </w:tc>
+        <w:tc>
+          <w:tcPr>
+            <w:tcW w:type="dxa" w:w="2954"/>
+          </w:tcPr>
+          <w:p>
+            <w:pPr>
+              <w:spacing w:before="0" w:after="0"/>
+            </w:pPr>
+            <w:r>
+              <w:rPr>
+                <w:sz w:val="20"/>
+              </w:rPr>
+              <w:t>If you must use a term, explain it where it appears.</w:t>
+            </w:r>
+          </w:p>
+        </w:tc>
+      </w:tr>
+    </w:tbl>
+    <w:p>
+      <w:pPr>
+        <w:spacing w:before="0" w:after="80"/>
+      </w:pPr>
+    </w:p>
     <w:tbl>
       <w:tblPr>
         <w:tblW w:w="9598" w:type="dxa"/>
@@ -3977,7 +4916,7 @@
             </w:pPr>
             <w:r>
               <w:rPr/>
-              <w:t>Hearth Energy, Ayo, Mirko, Tilda, Pia and Lukas are made up for this example. Descriptive buttons, simple consistent layouts and no figures of speech follow the Home Office poster for users on the autistic spectrum (Pun 2016).</w:t>
+              <w:t>Hearth Energy, Ayo, Mirko, Tilda, Pia and Lukas are made up for this example. Descriptive buttons, simple consistent layouts and no figures of speech follow the Home Office poster for users on the autistic spectrum (Pun 2016). The findings in the table of real evidence are real research results, rules and cases; the sources are listed below.</w:t>
             </w:r>
           </w:p>
         </w:tc>
@@ -4166,7 +5105,7 @@
           <w:color w:val="556274"/>
           <w:sz w:val="18"/>
         </w:rPr>
-        <w:t>Pun 2016 · W3C COGA 2021</w:t>
+        <w:t>Pun 2016 · W3C COGA 2021 · WCAG 2.2</w:t>
       </w:r>
     </w:p>
     <w:p>
@@ -4346,6 +5285,319 @@
         <w:t>Figure 5 · A Hearth Energy notice whose typography and language you can change · Exploratory.</w:t>
       </w:r>
     </w:p>
+    <w:p>
+      <w:pPr>
+        <w:spacing w:before="0" w:after="100"/>
+      </w:pPr>
+      <w:r>
+        <w:rPr>
+          <w:b/>
+        </w:rPr>
+        <w:t>Readability: what was tested</w:t>
+      </w:r>
+    </w:p>
+    <w:tbl>
+      <w:tblPr>
+        <w:tblW w:w="9638" w:type="dxa"/>
+        <w:tblBorders>
+          <w:top w:val="single" w:sz="4" w:space="0" w:color="D5DEE9"/>
+          <w:left w:val="single" w:sz="4" w:space="0" w:color="D5DEE9"/>
+          <w:bottom w:val="single" w:sz="4" w:space="0" w:color="D5DEE9"/>
+          <w:right w:val="single" w:sz="4" w:space="0" w:color="D5DEE9"/>
+          <w:insideH w:val="single" w:sz="4" w:space="0" w:color="D5DEE9"/>
+          <w:insideV w:val="single" w:sz="4" w:space="0" w:color="D5DEE9"/>
+        </w:tblBorders>
+        <w:tblLayout w:type="fixed"/>
+        <w:tblCellMar>
+          <w:top w:w="60" w:type="dxa"/>
+          <w:left w:w="100" w:type="dxa"/>
+          <w:bottom w:w="60" w:type="dxa"/>
+          <w:right w:w="100" w:type="dxa"/>
+        </w:tblCellMar>
+      </w:tblPr>
+      <w:tblGrid>
+        <w:gridCol w:w="1220"/>
+        <w:gridCol w:w="5622"/>
+        <w:gridCol w:w="2796"/>
+      </w:tblGrid>
+      <w:tr>
+        <w:trPr>
+          <w:cantSplit/>
+          <w:tblHeader/>
+        </w:trPr>
+        <w:tc>
+          <w:tcPr>
+            <w:tcW w:type="dxa" w:w="1220"/>
+            <w:shd w:val="clear" w:color="auto" w:fill="E6ECF4"/>
+          </w:tcPr>
+          <w:p>
+            <w:pPr>
+              <w:spacing w:before="0" w:after="0"/>
+            </w:pPr>
+            <w:r>
+              <w:rPr>
+                <w:b/>
+                <w:sz w:val="20"/>
+              </w:rPr>
+              <w:t>Finding</w:t>
+            </w:r>
+          </w:p>
+        </w:tc>
+        <w:tc>
+          <w:tcPr>
+            <w:tcW w:type="dxa" w:w="5622"/>
+            <w:shd w:val="clear" w:color="auto" w:fill="E6ECF4"/>
+          </w:tcPr>
+          <w:p>
+            <w:pPr>
+              <w:spacing w:before="0" w:after="0"/>
+            </w:pPr>
+            <w:r>
+              <w:rPr>
+                <w:b/>
+                <w:sz w:val="20"/>
+              </w:rPr>
+              <w:t>What was measured</w:t>
+            </w:r>
+          </w:p>
+        </w:tc>
+        <w:tc>
+          <w:tcPr>
+            <w:tcW w:type="dxa" w:w="2796"/>
+            <w:shd w:val="clear" w:color="auto" w:fill="E6ECF4"/>
+          </w:tcPr>
+          <w:p>
+            <w:pPr>
+              <w:spacing w:before="0" w:after="0"/>
+            </w:pPr>
+            <w:r>
+              <w:rPr>
+                <w:b/>
+                <w:sz w:val="20"/>
+              </w:rPr>
+              <w:t>What it means for a screen</w:t>
+            </w:r>
+          </w:p>
+        </w:tc>
+      </w:tr>
+      <w:tr>
+        <w:trPr>
+          <w:cantSplit/>
+        </w:trPr>
+        <w:tc>
+          <w:tcPr>
+            <w:tcW w:type="dxa" w:w="1220"/>
+          </w:tcPr>
+          <w:p>
+            <w:pPr>
+              <w:spacing w:before="0" w:after="0"/>
+            </w:pPr>
+            <w:r>
+              <w:rPr>
+                <w:sz w:val="20"/>
+              </w:rPr>
+              <w:t>Fonts</w:t>
+            </w:r>
+          </w:p>
+        </w:tc>
+        <w:tc>
+          <w:tcPr>
+            <w:tcW w:type="dxa" w:w="5622"/>
+          </w:tcPr>
+          <w:p>
+            <w:pPr>
+              <w:spacing w:before="0" w:after="0"/>
+            </w:pPr>
+            <w:r>
+              <w:rPr>
+                <w:sz w:val="20"/>
+              </w:rPr>
+              <w:t>Forty-eight readers with dyslexia read twelve texts in twelve fonts; Helvetica, Courier, Arial, Verdana and Computer Modern Unicode came out as good fonts, and italic fonts consistently reduced readability (Rello and Baeza-Yates 2013).</w:t>
+            </w:r>
+          </w:p>
+        </w:tc>
+        <w:tc>
+          <w:tcPr>
+            <w:tcW w:type="dxa" w:w="2796"/>
+          </w:tcPr>
+          <w:p>
+            <w:pPr>
+              <w:spacing w:before="0" w:after="0"/>
+            </w:pPr>
+            <w:r>
+              <w:rPr>
+                <w:sz w:val="20"/>
+              </w:rPr>
+              <w:t>Use a plain sans-serif for body text and avoid italics for blocks of text.</w:t>
+            </w:r>
+          </w:p>
+        </w:tc>
+      </w:tr>
+      <w:tr>
+        <w:trPr>
+          <w:cantSplit/>
+        </w:trPr>
+        <w:tc>
+          <w:tcPr>
+            <w:tcW w:type="dxa" w:w="1220"/>
+          </w:tcPr>
+          <w:p>
+            <w:pPr>
+              <w:spacing w:before="0" w:after="0"/>
+            </w:pPr>
+            <w:r>
+              <w:rPr>
+                <w:sz w:val="20"/>
+              </w:rPr>
+              <w:t>A special font</w:t>
+            </w:r>
+          </w:p>
+        </w:tc>
+        <w:tc>
+          <w:tcPr>
+            <w:tcW w:type="dxa" w:w="5622"/>
+          </w:tcPr>
+          <w:p>
+            <w:pPr>
+              <w:spacing w:before="0" w:after="0"/>
+            </w:pPr>
+            <w:r>
+              <w:rPr>
+                <w:sz w:val="20"/>
+              </w:rPr>
+              <w:t>In the same study a font made for dyslexia did not lead to better or worse readability than the standard fonts, and the participants preferred Verdana and Helvetica (Rello and Baeza-Yates 2013).</w:t>
+            </w:r>
+          </w:p>
+        </w:tc>
+        <w:tc>
+          <w:tcPr>
+            <w:tcW w:type="dxa" w:w="2796"/>
+          </w:tcPr>
+          <w:p>
+            <w:pPr>
+              <w:spacing w:before="0" w:after="0"/>
+            </w:pPr>
+            <w:r>
+              <w:rPr>
+                <w:sz w:val="20"/>
+              </w:rPr>
+              <w:t>A special font is not a shortcut: structure, size and spacing matter more.</w:t>
+            </w:r>
+          </w:p>
+        </w:tc>
+      </w:tr>
+      <w:tr>
+        <w:trPr>
+          <w:cantSplit/>
+        </w:trPr>
+        <w:tc>
+          <w:tcPr>
+            <w:tcW w:type="dxa" w:w="1220"/>
+          </w:tcPr>
+          <w:p>
+            <w:pPr>
+              <w:spacing w:before="0" w:after="0"/>
+            </w:pPr>
+            <w:r>
+              <w:rPr>
+                <w:sz w:val="20"/>
+              </w:rPr>
+              <w:t>A style guide</w:t>
+            </w:r>
+          </w:p>
+        </w:tc>
+        <w:tc>
+          <w:tcPr>
+            <w:tcW w:type="dxa" w:w="5622"/>
+          </w:tcPr>
+          <w:p>
+            <w:pPr>
+              <w:spacing w:before="0" w:after="0"/>
+            </w:pPr>
+            <w:r>
+              <w:rPr>
+                <w:sz w:val="20"/>
+              </w:rPr>
+              <w:t>The dyslexia style guide of the British Dyslexia Association recommends plain, left-aligned text with good spacing; summaries of it name sans-serif type of at least 12 points and a line spacing of about 1.5 (British Dyslexia Association 2023, as reported).</w:t>
+            </w:r>
+          </w:p>
+        </w:tc>
+        <w:tc>
+          <w:tcPr>
+            <w:tcW w:type="dxa" w:w="2796"/>
+          </w:tcPr>
+          <w:p>
+            <w:pPr>
+              <w:spacing w:before="0" w:after="0"/>
+            </w:pPr>
+            <w:r>
+              <w:rPr>
+                <w:sz w:val="20"/>
+              </w:rPr>
+              <w:t>Set type size and line spacing as rules in your components.</w:t>
+            </w:r>
+          </w:p>
+        </w:tc>
+      </w:tr>
+      <w:tr>
+        <w:trPr>
+          <w:cantSplit/>
+        </w:trPr>
+        <w:tc>
+          <w:tcPr>
+            <w:tcW w:type="dxa" w:w="1220"/>
+          </w:tcPr>
+          <w:p>
+            <w:pPr>
+              <w:spacing w:before="0" w:after="0"/>
+            </w:pPr>
+            <w:r>
+              <w:rPr>
+                <w:sz w:val="20"/>
+              </w:rPr>
+              <w:t>Reading level</w:t>
+            </w:r>
+          </w:p>
+        </w:tc>
+        <w:tc>
+          <w:tcPr>
+            <w:tcW w:type="dxa" w:w="5622"/>
+          </w:tcPr>
+          <w:p>
+            <w:pPr>
+              <w:spacing w:before="0" w:after="0"/>
+            </w:pPr>
+            <w:r>
+              <w:rPr>
+                <w:sz w:val="20"/>
+              </w:rPr>
+              <w:t>WCAG asks at its highest level for supplemental content when text requires a reading ability beyond the lower secondary level (3.1.5).</w:t>
+            </w:r>
+          </w:p>
+        </w:tc>
+        <w:tc>
+          <w:tcPr>
+            <w:tcW w:type="dxa" w:w="2796"/>
+          </w:tcPr>
+          <w:p>
+            <w:pPr>
+              <w:spacing w:before="0" w:after="0"/>
+            </w:pPr>
+            <w:r>
+              <w:rPr>
+                <w:sz w:val="20"/>
+              </w:rPr>
+              <w:t>Write at the level of the audience and give a summary where needed.</w:t>
+            </w:r>
+          </w:p>
+        </w:tc>
+      </w:tr>
+    </w:tbl>
+    <w:p>
+      <w:pPr>
+        <w:spacing w:before="0" w:after="80"/>
+      </w:pPr>
+    </w:p>
     <w:tbl>
       <w:tblPr>
         <w:tblW w:w="9598" w:type="dxa"/>
@@ -4395,7 +5647,7 @@
             </w:pPr>
             <w:r>
               <w:rPr/>
-              <w:t>Hearth Energy, Ayo, Mirko, Tilda, Pia and Lukas are made up for this example. The typography advice follows the British Dyslexia Association's style guide (2023) and the Home Office poster for users with dyslexia (Pun 2016).</w:t>
+              <w:t>Hearth Energy, Ayo, Mirko, Tilda, Pia and Lukas are made up for this example. The typography advice follows the British Dyslexia Association's style guide (2023) and the Home Office poster for users with dyslexia (Pun 2016). The findings in the table of real evidence are real research results, rules and cases; the sources are listed below.</w:t>
             </w:r>
           </w:p>
         </w:tc>
@@ -4584,7 +5836,7 @@
           <w:color w:val="556274"/>
           <w:sz w:val="18"/>
         </w:rPr>
-        <w:t>British Dyslexia Association 2023 · Pun 2016</w:t>
+        <w:t>British Dyslexia Association 2023 · Pun 2016 · Rello &amp; Baeza-Yates 2013 · WCAG 2.2</w:t>
       </w:r>
     </w:p>
     <w:p>
@@ -5123,6 +6375,319 @@
         <w:spacing w:before="0" w:after="80"/>
       </w:pPr>
     </w:p>
+    <w:p>
+      <w:pPr>
+        <w:spacing w:before="0" w:after="100"/>
+      </w:pPr>
+      <w:r>
+        <w:rPr>
+          <w:b/>
+        </w:rPr>
+        <w:t>Patterns, assistive technology and testing: evidence</w:t>
+      </w:r>
+    </w:p>
+    <w:tbl>
+      <w:tblPr>
+        <w:tblW w:w="9638" w:type="dxa"/>
+        <w:tblBorders>
+          <w:top w:val="single" w:sz="4" w:space="0" w:color="D5DEE9"/>
+          <w:left w:val="single" w:sz="4" w:space="0" w:color="D5DEE9"/>
+          <w:bottom w:val="single" w:sz="4" w:space="0" w:color="D5DEE9"/>
+          <w:right w:val="single" w:sz="4" w:space="0" w:color="D5DEE9"/>
+          <w:insideH w:val="single" w:sz="4" w:space="0" w:color="D5DEE9"/>
+          <w:insideV w:val="single" w:sz="4" w:space="0" w:color="D5DEE9"/>
+        </w:tblBorders>
+        <w:tblLayout w:type="fixed"/>
+        <w:tblCellMar>
+          <w:top w:w="60" w:type="dxa"/>
+          <w:left w:w="100" w:type="dxa"/>
+          <w:bottom w:w="60" w:type="dxa"/>
+          <w:right w:w="100" w:type="dxa"/>
+        </w:tblCellMar>
+      </w:tblPr>
+      <w:tblGrid>
+        <w:gridCol w:w="2201"/>
+        <w:gridCol w:w="4692"/>
+        <w:gridCol w:w="2745"/>
+      </w:tblGrid>
+      <w:tr>
+        <w:trPr>
+          <w:cantSplit/>
+          <w:tblHeader/>
+        </w:trPr>
+        <w:tc>
+          <w:tcPr>
+            <w:tcW w:type="dxa" w:w="2201"/>
+            <w:shd w:val="clear" w:color="auto" w:fill="E6ECF4"/>
+          </w:tcPr>
+          <w:p>
+            <w:pPr>
+              <w:spacing w:before="0" w:after="0"/>
+            </w:pPr>
+            <w:r>
+              <w:rPr>
+                <w:b/>
+                <w:sz w:val="20"/>
+              </w:rPr>
+              <w:t>Topic</w:t>
+            </w:r>
+          </w:p>
+        </w:tc>
+        <w:tc>
+          <w:tcPr>
+            <w:tcW w:type="dxa" w:w="4692"/>
+            <w:shd w:val="clear" w:color="auto" w:fill="E6ECF4"/>
+          </w:tcPr>
+          <w:p>
+            <w:pPr>
+              <w:spacing w:before="0" w:after="0"/>
+            </w:pPr>
+            <w:r>
+              <w:rPr>
+                <w:b/>
+                <w:sz w:val="20"/>
+              </w:rPr>
+              <w:t>Real finding or rule</w:t>
+            </w:r>
+          </w:p>
+        </w:tc>
+        <w:tc>
+          <w:tcPr>
+            <w:tcW w:type="dxa" w:w="2745"/>
+            <w:shd w:val="clear" w:color="auto" w:fill="E6ECF4"/>
+          </w:tcPr>
+          <w:p>
+            <w:pPr>
+              <w:spacing w:before="0" w:after="0"/>
+            </w:pPr>
+            <w:r>
+              <w:rPr>
+                <w:b/>
+                <w:sz w:val="20"/>
+              </w:rPr>
+              <w:t>What it means for a test</w:t>
+            </w:r>
+          </w:p>
+        </w:tc>
+      </w:tr>
+      <w:tr>
+        <w:trPr>
+          <w:cantSplit/>
+        </w:trPr>
+        <w:tc>
+          <w:tcPr>
+            <w:tcW w:type="dxa" w:w="2201"/>
+          </w:tcPr>
+          <w:p>
+            <w:pPr>
+              <w:spacing w:before="0" w:after="0"/>
+            </w:pPr>
+            <w:r>
+              <w:rPr>
+                <w:sz w:val="20"/>
+              </w:rPr>
+              <w:t>How many to test</w:t>
+            </w:r>
+          </w:p>
+        </w:tc>
+        <w:tc>
+          <w:tcPr>
+            <w:tcW w:type="dxa" w:w="4692"/>
+          </w:tcPr>
+          <w:p>
+            <w:pPr>
+              <w:spacing w:before="0" w:after="0"/>
+            </w:pPr>
+            <w:r>
+              <w:rPr>
+                <w:sz w:val="20"/>
+              </w:rPr>
+              <w:t>In Nielsen's model, five users find about 85% of the usability problems of a design in a qualitative test; for each distinct group of users more are needed (Nielsen 2000, as reported).</w:t>
+            </w:r>
+          </w:p>
+        </w:tc>
+        <w:tc>
+          <w:tcPr>
+            <w:tcW w:type="dxa" w:w="2745"/>
+          </w:tcPr>
+          <w:p>
+            <w:pPr>
+              <w:spacing w:before="0" w:after="0"/>
+            </w:pPr>
+            <w:r>
+              <w:rPr>
+                <w:sz w:val="20"/>
+              </w:rPr>
+              <w:t>Plan six or so participants per round, from several groups, and test again after fixes.</w:t>
+            </w:r>
+          </w:p>
+        </w:tc>
+      </w:tr>
+      <w:tr>
+        <w:trPr>
+          <w:cantSplit/>
+        </w:trPr>
+        <w:tc>
+          <w:tcPr>
+            <w:tcW w:type="dxa" w:w="2201"/>
+          </w:tcPr>
+          <w:p>
+            <w:pPr>
+              <w:spacing w:before="0" w:after="0"/>
+            </w:pPr>
+            <w:r>
+              <w:rPr>
+                <w:sz w:val="20"/>
+              </w:rPr>
+              <w:t>What a prototype shows</w:t>
+            </w:r>
+          </w:p>
+        </w:tc>
+        <w:tc>
+          <w:tcPr>
+            <w:tcW w:type="dxa" w:w="4692"/>
+          </w:tcPr>
+          <w:p>
+            <w:pPr>
+              <w:spacing w:before="0" w:after="0"/>
+            </w:pPr>
+            <w:r>
+              <w:rPr>
+                <w:sz w:val="20"/>
+              </w:rPr>
+              <w:t>A prototype can answer questions about role, look and feel and implementation (Houde and Hill 1997), and a hidden human can play the system in an early test (Kelley 1984).</w:t>
+            </w:r>
+          </w:p>
+        </w:tc>
+        <w:tc>
+          <w:tcPr>
+            <w:tcW w:type="dxa" w:w="2745"/>
+          </w:tcPr>
+          <w:p>
+            <w:pPr>
+              <w:spacing w:before="0" w:after="0"/>
+            </w:pPr>
+            <w:r>
+              <w:rPr>
+                <w:sz w:val="20"/>
+              </w:rPr>
+              <w:t>Say which question the prototype answers, and test before you build.</w:t>
+            </w:r>
+          </w:p>
+        </w:tc>
+      </w:tr>
+      <w:tr>
+        <w:trPr>
+          <w:cantSplit/>
+        </w:trPr>
+        <w:tc>
+          <w:tcPr>
+            <w:tcW w:type="dxa" w:w="2201"/>
+          </w:tcPr>
+          <w:p>
+            <w:pPr>
+              <w:spacing w:before="0" w:after="0"/>
+            </w:pPr>
+            <w:r>
+              <w:rPr>
+                <w:sz w:val="20"/>
+              </w:rPr>
+              <w:t>Authentication</w:t>
+            </w:r>
+          </w:p>
+        </w:tc>
+        <w:tc>
+          <w:tcPr>
+            <w:tcW w:type="dxa" w:w="4692"/>
+          </w:tcPr>
+          <w:p>
+            <w:pPr>
+              <w:spacing w:before="0" w:after="0"/>
+            </w:pPr>
+            <w:r>
+              <w:rPr>
+                <w:sz w:val="20"/>
+              </w:rPr>
+              <w:t>WCAG 2.2 asks that a login does not depend on remembering or transcribing a code, unless an alternative is offered (3.3.8).</w:t>
+            </w:r>
+          </w:p>
+        </w:tc>
+        <w:tc>
+          <w:tcPr>
+            <w:tcW w:type="dxa" w:w="2745"/>
+          </w:tcPr>
+          <w:p>
+            <w:pPr>
+              <w:spacing w:before="0" w:after="0"/>
+            </w:pPr>
+            <w:r>
+              <w:rPr>
+                <w:sz w:val="20"/>
+              </w:rPr>
+              <w:t>Test the login with a password manager and with paste.</w:t>
+            </w:r>
+          </w:p>
+        </w:tc>
+      </w:tr>
+      <w:tr>
+        <w:trPr>
+          <w:cantSplit/>
+        </w:trPr>
+        <w:tc>
+          <w:tcPr>
+            <w:tcW w:type="dxa" w:w="2201"/>
+          </w:tcPr>
+          <w:p>
+            <w:pPr>
+              <w:spacing w:before="0" w:after="0"/>
+            </w:pPr>
+            <w:r>
+              <w:rPr>
+                <w:sz w:val="20"/>
+              </w:rPr>
+              <w:t>Self-determined use</w:t>
+            </w:r>
+          </w:p>
+        </w:tc>
+        <w:tc>
+          <w:tcPr>
+            <w:tcW w:type="dxa" w:w="4692"/>
+          </w:tcPr>
+          <w:p>
+            <w:pPr>
+              <w:spacing w:before="0" w:after="0"/>
+            </w:pPr>
+            <w:r>
+              <w:rPr>
+                <w:sz w:val="20"/>
+              </w:rPr>
+              <w:t>People use their own assistive technologies and settings, such as a screen reader, reduced motion or a text size (WCAG 1.4.4, 2.3.3).</w:t>
+            </w:r>
+          </w:p>
+        </w:tc>
+        <w:tc>
+          <w:tcPr>
+            <w:tcW w:type="dxa" w:w="2745"/>
+          </w:tcPr>
+          <w:p>
+            <w:pPr>
+              <w:spacing w:before="0" w:after="0"/>
+            </w:pPr>
+            <w:r>
+              <w:rPr>
+                <w:sz w:val="20"/>
+              </w:rPr>
+              <w:t>Test with people's own settings and tools.</w:t>
+            </w:r>
+          </w:p>
+        </w:tc>
+      </w:tr>
+    </w:tbl>
+    <w:p>
+      <w:pPr>
+        <w:spacing w:before="0" w:after="80"/>
+      </w:pPr>
+    </w:p>
     <w:tbl>
       <w:tblPr>
         <w:tblW w:w="9598" w:type="dxa"/>
@@ -5172,7 +6737,7 @@
             </w:pPr>
             <w:r>
               <w:rPr/>
-              <w:t>Hearth Energy, Ayo, Mirko, Tilda, Pia and Lukas are made up for this example. Including people in usability testing and asking ahead about support follow the W3C's “Making Content Usable” (2021); choosing a prototype by its question follows Houde and Hill (1997) and Kelley (1984); rating options on the same criteria follows Gibbons (2018).</w:t>
+              <w:t>Hearth Energy, Ayo, Mirko, Tilda, Pia and Lukas are made up for this example. Including people in usability testing and asking ahead about support follow the W3C's “Making Content Usable” (2021); choosing a prototype by its question follows Houde and Hill (1997) and Kelley (1984); rating options on the same criteria follows Gibbons (2018). The findings in the table of real evidence are real research results, rules and cases; the sources are listed below.</w:t>
             </w:r>
           </w:p>
         </w:tc>
@@ -5361,7 +6926,7 @@
           <w:color w:val="556274"/>
           <w:sz w:val="18"/>
         </w:rPr>
-        <w:t>W3C COGA 2021 · Houde &amp; Hill 1997 · Kelley 1984 · Gibbons 2018</w:t>
+        <w:t>W3C COGA 2021 · Houde &amp; Hill 1997 · Kelley 1984 · Gibbons 2018 · Nielsen 2000 · WCAG 2.2</w:t>
       </w:r>
     </w:p>
     <w:p>
@@ -5668,6 +7233,266 @@
         <w:t>Figure 9 · The layers of a neurodiverse UX architecture, from a guiding vision to every product.</w:t>
       </w:r>
     </w:p>
+    <w:p>
+      <w:pPr>
+        <w:spacing w:before="0" w:after="100"/>
+      </w:pPr>
+      <w:r>
+        <w:rPr>
+          <w:b/>
+        </w:rPr>
+        <w:t>Neurodiverse UX as a better base architecture: structures</w:t>
+      </w:r>
+    </w:p>
+    <w:tbl>
+      <w:tblPr>
+        <w:tblW w:w="9638" w:type="dxa"/>
+        <w:tblBorders>
+          <w:top w:val="single" w:sz="4" w:space="0" w:color="D5DEE9"/>
+          <w:left w:val="single" w:sz="4" w:space="0" w:color="D5DEE9"/>
+          <w:bottom w:val="single" w:sz="4" w:space="0" w:color="D5DEE9"/>
+          <w:right w:val="single" w:sz="4" w:space="0" w:color="D5DEE9"/>
+          <w:insideH w:val="single" w:sz="4" w:space="0" w:color="D5DEE9"/>
+          <w:insideV w:val="single" w:sz="4" w:space="0" w:color="D5DEE9"/>
+        </w:tblBorders>
+        <w:tblLayout w:type="fixed"/>
+        <w:tblCellMar>
+          <w:top w:w="60" w:type="dxa"/>
+          <w:left w:w="100" w:type="dxa"/>
+          <w:bottom w:w="60" w:type="dxa"/>
+          <w:right w:w="100" w:type="dxa"/>
+        </w:tblCellMar>
+      </w:tblPr>
+      <w:tblGrid>
+        <w:gridCol w:w="1946"/>
+        <w:gridCol w:w="4856"/>
+        <w:gridCol w:w="2836"/>
+      </w:tblGrid>
+      <w:tr>
+        <w:trPr>
+          <w:cantSplit/>
+          <w:tblHeader/>
+        </w:trPr>
+        <w:tc>
+          <w:tcPr>
+            <w:tcW w:type="dxa" w:w="1946"/>
+            <w:shd w:val="clear" w:color="auto" w:fill="E6ECF4"/>
+          </w:tcPr>
+          <w:p>
+            <w:pPr>
+              <w:spacing w:before="0" w:after="0"/>
+            </w:pPr>
+            <w:r>
+              <w:rPr>
+                <w:b/>
+                <w:sz w:val="20"/>
+              </w:rPr>
+              <w:t>Part</w:t>
+            </w:r>
+          </w:p>
+        </w:tc>
+        <w:tc>
+          <w:tcPr>
+            <w:tcW w:type="dxa" w:w="4856"/>
+            <w:shd w:val="clear" w:color="auto" w:fill="E6ECF4"/>
+          </w:tcPr>
+          <w:p>
+            <w:pPr>
+              <w:spacing w:before="0" w:after="0"/>
+            </w:pPr>
+            <w:r>
+              <w:rPr>
+                <w:b/>
+                <w:sz w:val="20"/>
+              </w:rPr>
+              <w:t>Real example or rule</w:t>
+            </w:r>
+          </w:p>
+        </w:tc>
+        <w:tc>
+          <w:tcPr>
+            <w:tcW w:type="dxa" w:w="2836"/>
+            <w:shd w:val="clear" w:color="auto" w:fill="E6ECF4"/>
+          </w:tcPr>
+          <w:p>
+            <w:pPr>
+              <w:spacing w:before="0" w:after="0"/>
+            </w:pPr>
+            <w:r>
+              <w:rPr>
+                <w:b/>
+                <w:sz w:val="20"/>
+              </w:rPr>
+              <w:t>What it means</w:t>
+            </w:r>
+          </w:p>
+        </w:tc>
+      </w:tr>
+      <w:tr>
+        <w:trPr>
+          <w:cantSplit/>
+        </w:trPr>
+        <w:tc>
+          <w:tcPr>
+            <w:tcW w:type="dxa" w:w="1946"/>
+          </w:tcPr>
+          <w:p>
+            <w:pPr>
+              <w:spacing w:before="0" w:after="0"/>
+            </w:pPr>
+            <w:r>
+              <w:rPr>
+                <w:sz w:val="20"/>
+              </w:rPr>
+              <w:t>A shared base</w:t>
+            </w:r>
+          </w:p>
+        </w:tc>
+        <w:tc>
+          <w:tcPr>
+            <w:tcW w:type="dxa" w:w="4856"/>
+          </w:tcPr>
+          <w:p>
+            <w:pPr>
+              <w:spacing w:before="0" w:after="0"/>
+            </w:pPr>
+            <w:r>
+              <w:rPr>
+                <w:sz w:val="20"/>
+              </w:rPr>
+              <w:t>WCAG 2.2 added criteria that help people with cognitive and learning disabilities, such as redundant entry, accessible authentication and target size (WCAG 2.2).</w:t>
+            </w:r>
+          </w:p>
+        </w:tc>
+        <w:tc>
+          <w:tcPr>
+            <w:tcW w:type="dxa" w:w="2836"/>
+          </w:tcPr>
+          <w:p>
+            <w:pPr>
+              <w:spacing w:before="0" w:after="0"/>
+            </w:pPr>
+            <w:r>
+              <w:rPr>
+                <w:sz w:val="20"/>
+              </w:rPr>
+              <w:t>Put the criteria into the base components, so every team inherits them.</w:t>
+            </w:r>
+          </w:p>
+        </w:tc>
+      </w:tr>
+      <w:tr>
+        <w:trPr>
+          <w:cantSplit/>
+        </w:trPr>
+        <w:tc>
+          <w:tcPr>
+            <w:tcW w:type="dxa" w:w="1946"/>
+          </w:tcPr>
+          <w:p>
+            <w:pPr>
+              <w:spacing w:before="0" w:after="0"/>
+            </w:pPr>
+            <w:r>
+              <w:rPr>
+                <w:sz w:val="20"/>
+              </w:rPr>
+              <w:t>Supplemental guidance</w:t>
+            </w:r>
+          </w:p>
+        </w:tc>
+        <w:tc>
+          <w:tcPr>
+            <w:tcW w:type="dxa" w:w="4856"/>
+          </w:tcPr>
+          <w:p>
+            <w:pPr>
+              <w:spacing w:before="0" w:after="0"/>
+            </w:pPr>
+            <w:r>
+              <w:rPr>
+                <w:sz w:val="20"/>
+              </w:rPr>
+              <w:t>The cognitive accessibility guidance gives objectives and patterns beyond WCAG (W3C COGA 2021).</w:t>
+            </w:r>
+          </w:p>
+        </w:tc>
+        <w:tc>
+          <w:tcPr>
+            <w:tcW w:type="dxa" w:w="2836"/>
+          </w:tcPr>
+          <w:p>
+            <w:pPr>
+              <w:spacing w:before="0" w:after="0"/>
+            </w:pPr>
+            <w:r>
+              <w:rPr>
+                <w:sz w:val="20"/>
+              </w:rPr>
+              <w:t>Adopt the patterns that fit your journeys and test them.</w:t>
+            </w:r>
+          </w:p>
+        </w:tc>
+      </w:tr>
+      <w:tr>
+        <w:trPr>
+          <w:cantSplit/>
+        </w:trPr>
+        <w:tc>
+          <w:tcPr>
+            <w:tcW w:type="dxa" w:w="1946"/>
+          </w:tcPr>
+          <w:p>
+            <w:pPr>
+              <w:spacing w:before="0" w:after="0"/>
+            </w:pPr>
+            <w:r>
+              <w:rPr>
+                <w:sz w:val="20"/>
+              </w:rPr>
+              <w:t>Mismatch as a view</w:t>
+            </w:r>
+          </w:p>
+        </w:tc>
+        <w:tc>
+          <w:tcPr>
+            <w:tcW w:type="dxa" w:w="4856"/>
+          </w:tcPr>
+          <w:p>
+            <w:pPr>
+              <w:spacing w:before="0" w:after="0"/>
+            </w:pPr>
+            <w:r>
+              <w:rPr>
+                <w:sz w:val="20"/>
+              </w:rPr>
+              <w:t>Holmes treats disability as a mismatch between a person and a design and shows that solutions for one group extend to many (Holmes 2018).</w:t>
+            </w:r>
+          </w:p>
+        </w:tc>
+        <w:tc>
+          <w:tcPr>
+            <w:tcW w:type="dxa" w:w="2836"/>
+          </w:tcPr>
+          <w:p>
+            <w:pPr>
+              <w:spacing w:before="0" w:after="0"/>
+            </w:pPr>
+            <w:r>
+              <w:rPr>
+                <w:sz w:val="20"/>
+              </w:rPr>
+              <w:t>Design the base for the range, not for the average.</w:t>
+            </w:r>
+          </w:p>
+        </w:tc>
+      </w:tr>
+    </w:tbl>
+    <w:p>
+      <w:pPr>
+        <w:spacing w:before="0" w:after="80"/>
+      </w:pPr>
+    </w:p>
     <w:tbl>
       <w:tblPr>
         <w:tblW w:w="9598" w:type="dxa"/>
@@ -5717,7 +7542,7 @@
             </w:pPr>
             <w:r>
               <w:rPr/>
-              <w:t>Hearth Energy, Ayo, Mirko, Tilda, Pia and Lukas are made up for this example. Inclusion as better design for many follows Holmes (2018); a simplified version from the same code base follows the W3C's “Making Content Usable” (2021).</w:t>
+              <w:t>Hearth Energy, Ayo, Mirko, Tilda, Pia and Lukas are made up for this example. Inclusion as better design for many follows Holmes (2018); a simplified version from the same code base follows the W3C's “Making Content Usable” (2021). The findings in the table of real evidence are real research results, rules and cases; the sources are listed below.</w:t>
             </w:r>
           </w:p>
         </w:tc>
@@ -5906,7 +7731,7 @@
           <w:color w:val="556274"/>
           <w:sz w:val="18"/>
         </w:rPr>
-        <w:t>W3C COGA 2021 · Holmes 2018</w:t>
+        <w:t>W3C COGA 2021 · Holmes 2018 · WCAG 2.2</w:t>
       </w:r>
     </w:p>
     <w:p>
@@ -6399,6 +8224,266 @@
         <w:spacing w:before="0" w:after="80"/>
       </w:pPr>
     </w:p>
+    <w:p>
+      <w:pPr>
+        <w:spacing w:before="0" w:after="100"/>
+      </w:pPr>
+      <w:r>
+        <w:rPr>
+          <w:b/>
+        </w:rPr>
+        <w:t>Conflicts of neurodiverse UX, with evidence</w:t>
+      </w:r>
+    </w:p>
+    <w:tbl>
+      <w:tblPr>
+        <w:tblW w:w="9638" w:type="dxa"/>
+        <w:tblBorders>
+          <w:top w:val="single" w:sz="4" w:space="0" w:color="D5DEE9"/>
+          <w:left w:val="single" w:sz="4" w:space="0" w:color="D5DEE9"/>
+          <w:bottom w:val="single" w:sz="4" w:space="0" w:color="D5DEE9"/>
+          <w:right w:val="single" w:sz="4" w:space="0" w:color="D5DEE9"/>
+          <w:insideH w:val="single" w:sz="4" w:space="0" w:color="D5DEE9"/>
+          <w:insideV w:val="single" w:sz="4" w:space="0" w:color="D5DEE9"/>
+        </w:tblBorders>
+        <w:tblLayout w:type="fixed"/>
+        <w:tblCellMar>
+          <w:top w:w="60" w:type="dxa"/>
+          <w:left w:w="100" w:type="dxa"/>
+          <w:bottom w:w="60" w:type="dxa"/>
+          <w:right w:w="100" w:type="dxa"/>
+        </w:tblCellMar>
+      </w:tblPr>
+      <w:tblGrid>
+        <w:gridCol w:w="2494"/>
+        <w:gridCol w:w="3940"/>
+        <w:gridCol w:w="3204"/>
+      </w:tblGrid>
+      <w:tr>
+        <w:trPr>
+          <w:cantSplit/>
+          <w:tblHeader/>
+        </w:trPr>
+        <w:tc>
+          <w:tcPr>
+            <w:tcW w:type="dxa" w:w="2494"/>
+            <w:shd w:val="clear" w:color="auto" w:fill="E6ECF4"/>
+          </w:tcPr>
+          <w:p>
+            <w:pPr>
+              <w:spacing w:before="0" w:after="0"/>
+            </w:pPr>
+            <w:r>
+              <w:rPr>
+                <w:b/>
+                <w:sz w:val="20"/>
+              </w:rPr>
+              <w:t>Conflict</w:t>
+            </w:r>
+          </w:p>
+        </w:tc>
+        <w:tc>
+          <w:tcPr>
+            <w:tcW w:type="dxa" w:w="3940"/>
+            <w:shd w:val="clear" w:color="auto" w:fill="E6ECF4"/>
+          </w:tcPr>
+          <w:p>
+            <w:pPr>
+              <w:spacing w:before="0" w:after="0"/>
+            </w:pPr>
+            <w:r>
+              <w:rPr>
+                <w:b/>
+                <w:sz w:val="20"/>
+              </w:rPr>
+              <w:t>What the evidence says</w:t>
+            </w:r>
+          </w:p>
+        </w:tc>
+        <w:tc>
+          <w:tcPr>
+            <w:tcW w:type="dxa" w:w="3204"/>
+            <w:shd w:val="clear" w:color="auto" w:fill="E6ECF4"/>
+          </w:tcPr>
+          <w:p>
+            <w:pPr>
+              <w:spacing w:before="0" w:after="0"/>
+            </w:pPr>
+            <w:r>
+              <w:rPr>
+                <w:b/>
+                <w:sz w:val="20"/>
+              </w:rPr>
+              <w:t>A way to decide</w:t>
+            </w:r>
+          </w:p>
+        </w:tc>
+      </w:tr>
+      <w:tr>
+        <w:trPr>
+          <w:cantSplit/>
+        </w:trPr>
+        <w:tc>
+          <w:tcPr>
+            <w:tcW w:type="dxa" w:w="2494"/>
+          </w:tcPr>
+          <w:p>
+            <w:pPr>
+              <w:spacing w:before="0" w:after="0"/>
+            </w:pPr>
+            <w:r>
+              <w:rPr>
+                <w:sz w:val="20"/>
+              </w:rPr>
+              <w:t>One standard against individual adaptation</w:t>
+            </w:r>
+          </w:p>
+        </w:tc>
+        <w:tc>
+          <w:tcPr>
+            <w:tcW w:type="dxa" w:w="3940"/>
+          </w:tcPr>
+          <w:p>
+            <w:pPr>
+              <w:spacing w:before="0" w:after="0"/>
+            </w:pPr>
+            <w:r>
+              <w:rPr>
+                <w:sz w:val="20"/>
+              </w:rPr>
+              <w:t>A special font did not beat plain standard fonts in a study with readers with dyslexia (Rello and Baeza-Yates 2013).</w:t>
+            </w:r>
+          </w:p>
+        </w:tc>
+        <w:tc>
+          <w:tcPr>
+            <w:tcW w:type="dxa" w:w="3204"/>
+          </w:tcPr>
+          <w:p>
+            <w:pPr>
+              <w:spacing w:before="0" w:after="0"/>
+            </w:pPr>
+            <w:r>
+              <w:rPr>
+                <w:sz w:val="20"/>
+              </w:rPr>
+              <w:t>Ask which needs pull apart and which are shared; solve the shared ones in the base first.</w:t>
+            </w:r>
+          </w:p>
+        </w:tc>
+      </w:tr>
+      <w:tr>
+        <w:trPr>
+          <w:cantSplit/>
+        </w:trPr>
+        <w:tc>
+          <w:tcPr>
+            <w:tcW w:type="dxa" w:w="2494"/>
+          </w:tcPr>
+          <w:p>
+            <w:pPr>
+              <w:spacing w:before="0" w:after="0"/>
+            </w:pPr>
+            <w:r>
+              <w:rPr>
+                <w:sz w:val="20"/>
+              </w:rPr>
+              <w:t>A dynamic brand against a calm interface</w:t>
+            </w:r>
+          </w:p>
+        </w:tc>
+        <w:tc>
+          <w:tcPr>
+            <w:tcW w:type="dxa" w:w="3940"/>
+          </w:tcPr>
+          <w:p>
+            <w:pPr>
+              <w:spacing w:before="0" w:after="0"/>
+            </w:pPr>
+            <w:r>
+              <w:rPr>
+                <w:sz w:val="20"/>
+              </w:rPr>
+              <w:t>Auto-playing movement must be stoppable (WCAG 2.2.2).</w:t>
+            </w:r>
+          </w:p>
+        </w:tc>
+        <w:tc>
+          <w:tcPr>
+            <w:tcW w:type="dxa" w:w="3204"/>
+          </w:tcPr>
+          <w:p>
+            <w:pPr>
+              <w:spacing w:before="0" w:after="0"/>
+            </w:pPr>
+            <w:r>
+              <w:rPr>
+                <w:sz w:val="20"/>
+              </w:rPr>
+              <w:t>Let the brand live in images and headlines and keep the task area calm.</w:t>
+            </w:r>
+          </w:p>
+        </w:tc>
+      </w:tr>
+      <w:tr>
+        <w:trPr>
+          <w:cantSplit/>
+        </w:trPr>
+        <w:tc>
+          <w:tcPr>
+            <w:tcW w:type="dxa" w:w="2494"/>
+          </w:tcPr>
+          <w:p>
+            <w:pPr>
+              <w:spacing w:before="0" w:after="0"/>
+            </w:pPr>
+            <w:r>
+              <w:rPr>
+                <w:sz w:val="20"/>
+              </w:rPr>
+              <w:t>Test effort against the risk of not testing</w:t>
+            </w:r>
+          </w:p>
+        </w:tc>
+        <w:tc>
+          <w:tcPr>
+            <w:tcW w:type="dxa" w:w="3940"/>
+          </w:tcPr>
+          <w:p>
+            <w:pPr>
+              <w:spacing w:before="0" w:after="0"/>
+            </w:pPr>
+            <w:r>
+              <w:rPr>
+                <w:sz w:val="20"/>
+              </w:rPr>
+              <w:t>Five participants find most problems in a qualitative test (Nielsen 2000, as reported).</w:t>
+            </w:r>
+          </w:p>
+        </w:tc>
+        <w:tc>
+          <w:tcPr>
+            <w:tcW w:type="dxa" w:w="3204"/>
+          </w:tcPr>
+          <w:p>
+            <w:pPr>
+              <w:spacing w:before="0" w:after="0"/>
+            </w:pPr>
+            <w:r>
+              <w:rPr>
+                <w:sz w:val="20"/>
+              </w:rPr>
+              <w:t>Run a small test early rather than a large one late.</w:t>
+            </w:r>
+          </w:p>
+        </w:tc>
+      </w:tr>
+    </w:tbl>
+    <w:p>
+      <w:pPr>
+        <w:spacing w:before="0" w:after="80"/>
+      </w:pPr>
+    </w:p>
     <w:tbl>
       <w:tblPr>
         <w:tblW w:w="9598" w:type="dxa"/>
@@ -6448,7 +8533,7 @@
             </w:pPr>
             <w:r>
               <w:rPr/>
-              <w:t>Hearth Energy, Ayo, Mirko, Tilda, Pia and Lukas are made up for this example. That some needs pull in different directions, and that testing finds the balance, follows the Home Office's note on its posters (Pun 2016).</w:t>
+              <w:t>Hearth Energy, Ayo, Mirko, Tilda, Pia and Lukas are made up for this example. That some needs pull in different directions, and that testing finds the balance, follows the Home Office's note on its posters (Pun 2016). The findings in the table of real evidence are real research results, rules and cases; the sources are listed below.</w:t>
             </w:r>
           </w:p>
         </w:tc>
@@ -6637,7 +8722,7 @@
           <w:color w:val="556274"/>
           <w:sz w:val="18"/>
         </w:rPr>
-        <w:t>W3C COGA 2021 · Pun 2016</w:t>
+        <w:t>W3C COGA 2021 · Pun 2016 · Rello &amp; Baeza-Yates 2013 · WCAG 2.2 · Nielsen 2000</w:t>
       </w:r>
     </w:p>
     <w:p>
@@ -7130,6 +9215,266 @@
         <w:spacing w:before="0" w:after="80"/>
       </w:pPr>
     </w:p>
+    <w:p>
+      <w:pPr>
+        <w:spacing w:before="0" w:after="100"/>
+      </w:pPr>
+      <w:r>
+        <w:rPr>
+          <w:b/>
+        </w:rPr>
+        <w:t>Owning neurodiverse UX: real rules</w:t>
+      </w:r>
+    </w:p>
+    <w:tbl>
+      <w:tblPr>
+        <w:tblW w:w="9638" w:type="dxa"/>
+        <w:tblBorders>
+          <w:top w:val="single" w:sz="4" w:space="0" w:color="D5DEE9"/>
+          <w:left w:val="single" w:sz="4" w:space="0" w:color="D5DEE9"/>
+          <w:bottom w:val="single" w:sz="4" w:space="0" w:color="D5DEE9"/>
+          <w:right w:val="single" w:sz="4" w:space="0" w:color="D5DEE9"/>
+          <w:insideH w:val="single" w:sz="4" w:space="0" w:color="D5DEE9"/>
+          <w:insideV w:val="single" w:sz="4" w:space="0" w:color="D5DEE9"/>
+        </w:tblBorders>
+        <w:tblLayout w:type="fixed"/>
+        <w:tblCellMar>
+          <w:top w:w="60" w:type="dxa"/>
+          <w:left w:w="100" w:type="dxa"/>
+          <w:bottom w:w="60" w:type="dxa"/>
+          <w:right w:w="100" w:type="dxa"/>
+        </w:tblCellMar>
+      </w:tblPr>
+      <w:tblGrid>
+        <w:gridCol w:w="1439"/>
+        <w:gridCol w:w="4650"/>
+        <w:gridCol w:w="3549"/>
+      </w:tblGrid>
+      <w:tr>
+        <w:trPr>
+          <w:cantSplit/>
+          <w:tblHeader/>
+        </w:trPr>
+        <w:tc>
+          <w:tcPr>
+            <w:tcW w:type="dxa" w:w="1439"/>
+            <w:shd w:val="clear" w:color="auto" w:fill="E6ECF4"/>
+          </w:tcPr>
+          <w:p>
+            <w:pPr>
+              <w:spacing w:before="0" w:after="0"/>
+            </w:pPr>
+            <w:r>
+              <w:rPr>
+                <w:b/>
+                <w:sz w:val="20"/>
+              </w:rPr>
+              <w:t>Part</w:t>
+            </w:r>
+          </w:p>
+        </w:tc>
+        <w:tc>
+          <w:tcPr>
+            <w:tcW w:type="dxa" w:w="4650"/>
+            <w:shd w:val="clear" w:color="auto" w:fill="E6ECF4"/>
+          </w:tcPr>
+          <w:p>
+            <w:pPr>
+              <w:spacing w:before="0" w:after="0"/>
+            </w:pPr>
+            <w:r>
+              <w:rPr>
+                <w:b/>
+                <w:sz w:val="20"/>
+              </w:rPr>
+              <w:t>Real rule or source</w:t>
+            </w:r>
+          </w:p>
+        </w:tc>
+        <w:tc>
+          <w:tcPr>
+            <w:tcW w:type="dxa" w:w="3549"/>
+            <w:shd w:val="clear" w:color="auto" w:fill="E6ECF4"/>
+          </w:tcPr>
+          <w:p>
+            <w:pPr>
+              <w:spacing w:before="0" w:after="0"/>
+            </w:pPr>
+            <w:r>
+              <w:rPr>
+                <w:b/>
+                <w:sz w:val="20"/>
+              </w:rPr>
+              <w:t>What it means</w:t>
+            </w:r>
+          </w:p>
+        </w:tc>
+      </w:tr>
+      <w:tr>
+        <w:trPr>
+          <w:cantSplit/>
+        </w:trPr>
+        <w:tc>
+          <w:tcPr>
+            <w:tcW w:type="dxa" w:w="1439"/>
+          </w:tcPr>
+          <w:p>
+            <w:pPr>
+              <w:spacing w:before="0" w:after="0"/>
+            </w:pPr>
+            <w:r>
+              <w:rPr>
+                <w:sz w:val="20"/>
+              </w:rPr>
+              <w:t>Test strategy</w:t>
+            </w:r>
+          </w:p>
+        </w:tc>
+        <w:tc>
+          <w:tcPr>
+            <w:tcW w:type="dxa" w:w="4650"/>
+          </w:tcPr>
+          <w:p>
+            <w:pPr>
+              <w:spacing w:before="0" w:after="0"/>
+            </w:pPr>
+            <w:r>
+              <w:rPr>
+                <w:sz w:val="20"/>
+              </w:rPr>
+              <w:t>A small qualitative test with several groups finds most serious problems (Nielsen 2000, as reported).</w:t>
+            </w:r>
+          </w:p>
+        </w:tc>
+        <w:tc>
+          <w:tcPr>
+            <w:tcW w:type="dxa" w:w="3549"/>
+          </w:tcPr>
+          <w:p>
+            <w:pPr>
+              <w:spacing w:before="0" w:after="0"/>
+            </w:pPr>
+            <w:r>
+              <w:rPr>
+                <w:sz w:val="20"/>
+              </w:rPr>
+              <w:t>Fix the number and the groups in the plan, and name who runs it.</w:t>
+            </w:r>
+          </w:p>
+        </w:tc>
+      </w:tr>
+      <w:tr>
+        <w:trPr>
+          <w:cantSplit/>
+        </w:trPr>
+        <w:tc>
+          <w:tcPr>
+            <w:tcW w:type="dxa" w:w="1439"/>
+          </w:tcPr>
+          <w:p>
+            <w:pPr>
+              <w:spacing w:before="0" w:after="0"/>
+            </w:pPr>
+            <w:r>
+              <w:rPr>
+                <w:sz w:val="20"/>
+              </w:rPr>
+              <w:t>Checks</w:t>
+            </w:r>
+          </w:p>
+        </w:tc>
+        <w:tc>
+          <w:tcPr>
+            <w:tcW w:type="dxa" w:w="4650"/>
+          </w:tcPr>
+          <w:p>
+            <w:pPr>
+              <w:spacing w:before="0" w:after="0"/>
+            </w:pPr>
+            <w:r>
+              <w:rPr>
+                <w:sz w:val="20"/>
+              </w:rPr>
+              <w:t>WCAG 2.2 gives testable criteria for each requirement.</w:t>
+            </w:r>
+          </w:p>
+        </w:tc>
+        <w:tc>
+          <w:tcPr>
+            <w:tcW w:type="dxa" w:w="3549"/>
+          </w:tcPr>
+          <w:p>
+            <w:pPr>
+              <w:spacing w:before="0" w:after="0"/>
+            </w:pPr>
+            <w:r>
+              <w:rPr>
+                <w:sz w:val="20"/>
+              </w:rPr>
+              <w:t>Put a pattern check in the definition of done.</w:t>
+            </w:r>
+          </w:p>
+        </w:tc>
+      </w:tr>
+      <w:tr>
+        <w:trPr>
+          <w:cantSplit/>
+        </w:trPr>
+        <w:tc>
+          <w:tcPr>
+            <w:tcW w:type="dxa" w:w="1439"/>
+          </w:tcPr>
+          <w:p>
+            <w:pPr>
+              <w:spacing w:before="0" w:after="0"/>
+            </w:pPr>
+            <w:r>
+              <w:rPr>
+                <w:sz w:val="20"/>
+              </w:rPr>
+              <w:t>Owners</w:t>
+            </w:r>
+          </w:p>
+        </w:tc>
+        <w:tc>
+          <w:tcPr>
+            <w:tcW w:type="dxa" w:w="4650"/>
+          </w:tcPr>
+          <w:p>
+            <w:pPr>
+              <w:spacing w:before="0" w:after="0"/>
+            </w:pPr>
+            <w:r>
+              <w:rPr>
+                <w:sz w:val="20"/>
+              </w:rPr>
+              <w:t>Supplemental patterns have no conformance level of their own (W3C COGA 2021).</w:t>
+            </w:r>
+          </w:p>
+        </w:tc>
+        <w:tc>
+          <w:tcPr>
+            <w:tcW w:type="dxa" w:w="3549"/>
+          </w:tcPr>
+          <w:p>
+            <w:pPr>
+              <w:spacing w:before="0" w:after="0"/>
+            </w:pPr>
+            <w:r>
+              <w:rPr>
+                <w:sz w:val="20"/>
+              </w:rPr>
+              <w:t>Name an owner for the patterns, or they are not applied.</w:t>
+            </w:r>
+          </w:p>
+        </w:tc>
+      </w:tr>
+    </w:tbl>
+    <w:p>
+      <w:pPr>
+        <w:spacing w:before="0" w:after="80"/>
+      </w:pPr>
+    </w:p>
     <w:tbl>
       <w:tblPr>
         <w:tblW w:w="9598" w:type="dxa"/>
@@ -7179,7 +9524,7 @@
             </w:pPr>
             <w:r>
               <w:rPr/>
-              <w:t>Hearth Energy, Ayo, Mirko, Tilda, Pia and Lukas are made up for this example. Including people with cognitive and learning disabilities in research and testing follows the W3C's “Making Content Usable” (2021); deciding with limited information follows Simon (1956); the premortem follows Klein (2007).</w:t>
+              <w:t>Hearth Energy, Ayo, Mirko, Tilda, Pia and Lukas are made up for this example. Including people with cognitive and learning disabilities in research and testing follows the W3C's “Making Content Usable” (2021); deciding with limited information follows Simon (1956); the premortem follows Klein (2007). The findings in the table of real evidence are real research results, rules and cases; the sources are listed below.</w:t>
             </w:r>
           </w:p>
         </w:tc>
@@ -7368,7 +9713,7 @@
           <w:color w:val="556274"/>
           <w:sz w:val="18"/>
         </w:rPr>
-        <w:t>W3C COGA 2021 · Simon 1956 · Klein 2007</w:t>
+        <w:t>W3C COGA 2021 · Simon 1956 · Klein 2007 · Nielsen 2000 · WCAG 2.2</w:t>
       </w:r>
     </w:p>
     <w:p>
@@ -8053,7 +10398,67 @@
         <w:rPr>
           <w:sz w:val="19"/>
         </w:rPr>
+        <w:t>Polanczyk, G., de Lima, M. S., Horta, B. L., Biederman, J., &amp; Rohde, L. A. (2007). The worldwide prevalence of ADHD: A systematic review and metaregression analysis. American Journal of Psychiatry, 164(6), 942–948. https://doi.org/10.1176/ajp.2007.164.6.942 (A pooled prevalence of 5.29% in people aged 18 or younger, from 102 studies; estimates vary mostly with study method.)</w:t>
+      </w:r>
+    </w:p>
+    <w:p>
+      <w:pPr>
+        <w:spacing w:before="0" w:after="80"/>
+        <w:ind w:left="283" w:hanging="283"/>
+      </w:pPr>
+      <w:r>
+        <w:rPr>
+          <w:sz w:val="19"/>
+        </w:rPr>
+        <w:t>World Health Organization. Autism spectrum disorders (fact sheet, 2022 edition). https://www.who.int/news-room/fact-sheets/detail/autism-spectrum-disorders (About one in 100 children has autism, as an average estimate; reported prevalence varies a lot between studies.)</w:t>
+      </w:r>
+    </w:p>
+    <w:p>
+      <w:pPr>
+        <w:spacing w:before="0" w:after="80"/>
+        <w:ind w:left="283" w:hanging="283"/>
+      </w:pPr>
+      <w:r>
+        <w:rPr>
+          <w:sz w:val="19"/>
+        </w:rPr>
+        <w:t>Dyslexia Action. The prevalence of dyslexia. https://dyslexiaaction.org.uk/ (Prevalence depends on the definition and is best described as a continuum; the often-quoted 10% figure has no traceable original source.)</w:t>
+      </w:r>
+    </w:p>
+    <w:p>
+      <w:pPr>
+        <w:spacing w:before="0" w:after="80"/>
+        <w:ind w:left="283" w:hanging="283"/>
+      </w:pPr>
+      <w:r>
+        <w:rPr>
+          <w:sz w:val="19"/>
+        </w:rPr>
         <w:t>W3C (2021). Making Content Usable for People with Cognitive and Learning Disabilities. W3C Working Group Note, 29 April 2021. https://www.w3.org/TR/coga-usable/ (Eight objectives and design patterns for cognitive accessibility, and how to include people in design and usability testing.)</w:t>
+      </w:r>
+    </w:p>
+    <w:p>
+      <w:pPr>
+        <w:spacing w:before="0" w:after="80"/>
+        <w:ind w:left="283" w:hanging="283"/>
+      </w:pPr>
+      <w:r>
+        <w:rPr>
+          <w:sz w:val="19"/>
+        </w:rPr>
+        <w:t>W3C (2023). Web Content Accessibility Guidelines (WCAG) 2.2. https://www.w3.org/TR/WCAG22/ (Success criterion 1.4.1 Use of Color: colour must not be the only way to convey information; 1.4.3 Contrast (Minimum) for text.)</w:t>
+      </w:r>
+    </w:p>
+    <w:p>
+      <w:pPr>
+        <w:spacing w:before="0" w:after="80"/>
+        <w:ind w:left="283" w:hanging="283"/>
+      </w:pPr>
+      <w:r>
+        <w:rPr>
+          <w:sz w:val="19"/>
+        </w:rPr>
+        <w:t>Rello, L., &amp; Baeza-Yates, R. (2013). Good fonts for dyslexia. Proceedings of ASSETS '13, Article 14. (Forty-eight readers with dyslexia read twelve texts in twelve fonts; sans-serif and monospaced fonts such as Helvetica, Courier, Arial and Verdana did well, italics reduced readability, and a font made for dyslexia gave no benefit.)</w:t>
       </w:r>
     </w:p>
     <w:p>
@@ -8090,6 +10495,18 @@
           <w:sz w:val="19"/>
         </w:rPr>
         <w:t>Gibbons, S. (2018). Using Prioritization Matrices to Inform UX Decisions. Nielsen Norman Group. https://www.nngroup.com/articles/prioritization-matrices/ (Rate each option on the same few criteria, such as value to the user against effort, and put the reason next to each rating.)</w:t>
+      </w:r>
+    </w:p>
+    <w:p>
+      <w:pPr>
+        <w:spacing w:before="0" w:after="80"/>
+        <w:ind w:left="283" w:hanging="283"/>
+      </w:pPr>
+      <w:r>
+        <w:rPr>
+          <w:sz w:val="19"/>
+        </w:rPr>
+        <w:t>Nielsen, J. (2000). Why you only need to test with 5 users. Nielsen Norman Group. https://www.nngroup.com/articles/why-you-only-need-to-test-with-5-users/ (Based on a model by Nielsen and Landauer (1993): about five users find about 85% of the problems in a qualitative test; more are needed per group and for quantitative work. Figures from summaries.)</w:t>
       </w:r>
     </w:p>
     <w:p>
@@ -8174,9 +10591,9 @@
         </w:tblCellMar>
       </w:tblPr>
       <w:tblGrid>
-        <w:gridCol w:w="2134"/>
-        <w:gridCol w:w="5198"/>
-        <w:gridCol w:w="1403"/>
+        <w:gridCol w:w="2125"/>
+        <w:gridCol w:w="5230"/>
+        <w:gridCol w:w="1380"/>
         <w:gridCol w:w="903"/>
       </w:tblGrid>
       <w:tr>
@@ -8186,7 +10603,7 @@
         </w:trPr>
         <w:tc>
           <w:tcPr>
-            <w:tcW w:type="dxa" w:w="2134"/>
+            <w:tcW w:type="dxa" w:w="2125"/>
             <w:shd w:val="clear" w:color="auto" w:fill="E6ECF4"/>
           </w:tcPr>
           <w:p>
@@ -8204,7 +10621,7 @@
         </w:tc>
         <w:tc>
           <w:tcPr>
-            <w:tcW w:type="dxa" w:w="5198"/>
+            <w:tcW w:type="dxa" w:w="5230"/>
             <w:shd w:val="clear" w:color="auto" w:fill="E6ECF4"/>
           </w:tcPr>
           <w:p>
@@ -8222,7 +10639,7 @@
         </w:tc>
         <w:tc>
           <w:tcPr>
-            <w:tcW w:type="dxa" w:w="1403"/>
+            <w:tcW w:type="dxa" w:w="1380"/>
             <w:shd w:val="clear" w:color="auto" w:fill="E6ECF4"/>
           </w:tcPr>
           <w:p>
@@ -8263,7 +10680,7 @@
         </w:trPr>
         <w:tc>
           <w:tcPr>
-            <w:tcW w:type="dxa" w:w="2134"/>
+            <w:tcW w:type="dxa" w:w="2125"/>
           </w:tcPr>
           <w:p>
             <w:pPr>
@@ -8274,13 +10691,13 @@
                 <w:b/>
                 <w:sz w:val="19"/>
               </w:rPr>
-              <w:t>Adaptation mode</w:t>
-            </w:r>
-          </w:p>
-        </w:tc>
-        <w:tc>
-          <w:tcPr>
-            <w:tcW w:type="dxa" w:w="5198"/>
+              <w:t>Accessibility</w:t>
+            </w:r>
+          </w:p>
+        </w:tc>
+        <w:tc>
+          <w:tcPr>
+            <w:tcW w:type="dxa" w:w="5230"/>
           </w:tcPr>
           <w:p>
             <w:pPr>
@@ -8290,13 +10707,13 @@
               <w:rPr>
                 <w:sz w:val="19"/>
               </w:rPr>
-              <w:t>An optional setting that changes how a product looks or behaves for someone's needs, such as fewer stimuli, a reading mode or a simplified view; it works best on top of a good default.</w:t>
-            </w:r>
-          </w:p>
-        </w:tc>
-        <w:tc>
-          <w:tcPr>
-            <w:tcW w:type="dxa" w:w="1403"/>
+              <w:t>Designing so that everyone can use a product, also people who see less well, see colours differently, or use a keyboard or a screen reader.</w:t>
+            </w:r>
+          </w:p>
+        </w:tc>
+        <w:tc>
+          <w:tcPr>
+            <w:tcW w:type="dxa" w:w="1380"/>
           </w:tcPr>
           <w:p>
             <w:pPr>
@@ -8322,7 +10739,7 @@
               <w:rPr>
                 <w:sz w:val="19"/>
               </w:rPr>
-              <w:t>Day 13</w:t>
+              <w:t>Day 3</w:t>
             </w:r>
           </w:p>
         </w:tc>
@@ -8333,7 +10750,7 @@
         </w:trPr>
         <w:tc>
           <w:tcPr>
-            <w:tcW w:type="dxa" w:w="2134"/>
+            <w:tcW w:type="dxa" w:w="2125"/>
           </w:tcPr>
           <w:p>
             <w:pPr>
@@ -8344,13 +10761,13 @@
                 <w:b/>
                 <w:sz w:val="19"/>
               </w:rPr>
-              <w:t>ADHD</w:t>
-            </w:r>
-          </w:p>
-        </w:tc>
-        <w:tc>
-          <w:tcPr>
-            <w:tcW w:type="dxa" w:w="5198"/>
+              <w:t>Adaptation mode</w:t>
+            </w:r>
+          </w:p>
+        </w:tc>
+        <w:tc>
+          <w:tcPr>
+            <w:tcW w:type="dxa" w:w="5230"/>
           </w:tcPr>
           <w:p>
             <w:pPr>
@@ -8360,13 +10777,13 @@
               <w:rPr>
                 <w:sz w:val="19"/>
               </w:rPr>
-              <w:t>Attention deficit hyperactivity disorder: a different way of directing attention and controlling impulses; busy pages, distractions and long unstructured tasks are especially hard.</w:t>
-            </w:r>
-          </w:p>
-        </w:tc>
-        <w:tc>
-          <w:tcPr>
-            <w:tcW w:type="dxa" w:w="1403"/>
+              <w:t>An optional setting that changes how a product looks or behaves for someone's needs, such as fewer stimuli, a reading mode or a simplified view; it works best on top of a good default.</w:t>
+            </w:r>
+          </w:p>
+        </w:tc>
+        <w:tc>
+          <w:tcPr>
+            <w:tcW w:type="dxa" w:w="1380"/>
           </w:tcPr>
           <w:p>
             <w:pPr>
@@ -8403,7 +10820,7 @@
         </w:trPr>
         <w:tc>
           <w:tcPr>
-            <w:tcW w:type="dxa" w:w="2134"/>
+            <w:tcW w:type="dxa" w:w="2125"/>
           </w:tcPr>
           <w:p>
             <w:pPr>
@@ -8414,13 +10831,13 @@
                 <w:b/>
                 <w:sz w:val="19"/>
               </w:rPr>
-              <w:t>Assistive technology</w:t>
-            </w:r>
-          </w:p>
-        </w:tc>
-        <w:tc>
-          <w:tcPr>
-            <w:tcW w:type="dxa" w:w="5198"/>
+              <w:t>ADHD</w:t>
+            </w:r>
+          </w:p>
+        </w:tc>
+        <w:tc>
+          <w:tcPr>
+            <w:tcW w:type="dxa" w:w="5230"/>
           </w:tcPr>
           <w:p>
             <w:pPr>
@@ -8430,13 +10847,13 @@
               <w:rPr>
                 <w:sz w:val="19"/>
               </w:rPr>
-              <w:t>Tools people use to operate digital products, such as a screen reader that reads the screen aloud, a magnifier, a switch or voice control.</w:t>
-            </w:r>
-          </w:p>
-        </w:tc>
-        <w:tc>
-          <w:tcPr>
-            <w:tcW w:type="dxa" w:w="1403"/>
+              <w:t>Attention deficit hyperactivity disorder: a different way of directing attention and controlling impulses; busy pages, distractions and long unstructured tasks are especially hard.</w:t>
+            </w:r>
+          </w:p>
+        </w:tc>
+        <w:tc>
+          <w:tcPr>
+            <w:tcW w:type="dxa" w:w="1380"/>
           </w:tcPr>
           <w:p>
             <w:pPr>
@@ -8462,7 +10879,7 @@
               <w:rPr>
                 <w:sz w:val="19"/>
               </w:rPr>
-              <w:t>Day 12</w:t>
+              <w:t>Day 13</w:t>
             </w:r>
           </w:p>
         </w:tc>
@@ -8473,7 +10890,7 @@
         </w:trPr>
         <w:tc>
           <w:tcPr>
-            <w:tcW w:type="dxa" w:w="2134"/>
+            <w:tcW w:type="dxa" w:w="2125"/>
           </w:tcPr>
           <w:p>
             <w:pPr>
@@ -8484,13 +10901,13 @@
                 <w:b/>
                 <w:sz w:val="19"/>
               </w:rPr>
-              <w:t>Attention</w:t>
-            </w:r>
-          </w:p>
-        </w:tc>
-        <w:tc>
-          <w:tcPr>
-            <w:tcW w:type="dxa" w:w="5198"/>
+              <w:t>Assistive technology</w:t>
+            </w:r>
+          </w:p>
+        </w:tc>
+        <w:tc>
+          <w:tcPr>
+            <w:tcW w:type="dxa" w:w="5230"/>
           </w:tcPr>
           <w:p>
             <w:pPr>
@@ -8500,13 +10917,13 @@
               <w:rPr>
                 <w:sz w:val="19"/>
               </w:rPr>
-              <w:t>The mind's spotlight. Only a small part of a screen is processed at any moment; attention decides which part.</w:t>
-            </w:r>
-          </w:p>
-        </w:tc>
-        <w:tc>
-          <w:tcPr>
-            <w:tcW w:type="dxa" w:w="1403"/>
+              <w:t>Tools people use to operate digital products, such as a screen reader that reads the screen aloud, a magnifier, a switch or voice control.</w:t>
+            </w:r>
+          </w:p>
+        </w:tc>
+        <w:tc>
+          <w:tcPr>
+            <w:tcW w:type="dxa" w:w="1380"/>
           </w:tcPr>
           <w:p>
             <w:pPr>
@@ -8516,7 +10933,7 @@
               <w:rPr>
                 <w:sz w:val="19"/>
               </w:rPr>
-              <w:t>A flashing banner takes attention away from the form you were filling in.</w:t>
+              <w:t>—</w:t>
             </w:r>
           </w:p>
         </w:tc>
@@ -8532,7 +10949,7 @@
               <w:rPr>
                 <w:sz w:val="19"/>
               </w:rPr>
-              <w:t>Day 1</w:t>
+              <w:t>Day 12</w:t>
             </w:r>
           </w:p>
         </w:tc>
@@ -8543,7 +10960,7 @@
         </w:trPr>
         <w:tc>
           <w:tcPr>
-            <w:tcW w:type="dxa" w:w="2134"/>
+            <w:tcW w:type="dxa" w:w="2125"/>
           </w:tcPr>
           <w:p>
             <w:pPr>
@@ -8554,13 +10971,13 @@
                 <w:b/>
                 <w:sz w:val="19"/>
               </w:rPr>
-              <w:t>Autism</w:t>
-            </w:r>
-          </w:p>
-        </w:tc>
-        <w:tc>
-          <w:tcPr>
-            <w:tcW w:type="dxa" w:w="5198"/>
+              <w:t>Attention</w:t>
+            </w:r>
+          </w:p>
+        </w:tc>
+        <w:tc>
+          <w:tcPr>
+            <w:tcW w:type="dxa" w:w="5230"/>
           </w:tcPr>
           <w:p>
             <w:pPr>
@@ -8570,13 +10987,13 @@
               <w:rPr>
                 <w:sz w:val="19"/>
               </w:rPr>
-              <w:t>A different way of perceiving and processing; inconsistent patterns, ambiguous words and sensory overload are especially hard, predictability helps.</w:t>
-            </w:r>
-          </w:p>
-        </w:tc>
-        <w:tc>
-          <w:tcPr>
-            <w:tcW w:type="dxa" w:w="1403"/>
+              <w:t>The mind's spotlight. Only a small part of a screen is processed at any moment; attention decides which part.</w:t>
+            </w:r>
+          </w:p>
+        </w:tc>
+        <w:tc>
+          <w:tcPr>
+            <w:tcW w:type="dxa" w:w="1380"/>
           </w:tcPr>
           <w:p>
             <w:pPr>
@@ -8586,7 +11003,7 @@
               <w:rPr>
                 <w:sz w:val="19"/>
               </w:rPr>
-              <w:t>—</w:t>
+              <w:t>A flashing banner takes attention away from the form you were filling in.</w:t>
             </w:r>
           </w:p>
         </w:tc>
@@ -8602,7 +11019,7 @@
               <w:rPr>
                 <w:sz w:val="19"/>
               </w:rPr>
-              <w:t>Day 13</w:t>
+              <w:t>Day 1</w:t>
             </w:r>
           </w:p>
         </w:tc>
@@ -8613,7 +11030,7 @@
         </w:trPr>
         <w:tc>
           <w:tcPr>
-            <w:tcW w:type="dxa" w:w="2134"/>
+            <w:tcW w:type="dxa" w:w="2125"/>
           </w:tcPr>
           <w:p>
             <w:pPr>
@@ -8624,13 +11041,13 @@
                 <w:b/>
                 <w:sz w:val="19"/>
               </w:rPr>
-              <w:t>Badge</w:t>
-            </w:r>
-          </w:p>
-        </w:tc>
-        <w:tc>
-          <w:tcPr>
-            <w:tcW w:type="dxa" w:w="5198"/>
+              <w:t>Autism</w:t>
+            </w:r>
+          </w:p>
+        </w:tc>
+        <w:tc>
+          <w:tcPr>
+            <w:tcW w:type="dxa" w:w="5230"/>
           </w:tcPr>
           <w:p>
             <w:pPr>
@@ -8640,13 +11057,13 @@
               <w:rPr>
                 <w:sz w:val="19"/>
               </w:rPr>
-              <w:t>A small symbol that marks something someone has done; it means something only while it is rare.</w:t>
-            </w:r>
-          </w:p>
-        </w:tc>
-        <w:tc>
-          <w:tcPr>
-            <w:tcW w:type="dxa" w:w="1403"/>
+              <w:t>A different way of perceiving and processing; inconsistent patterns, ambiguous words and sensory overload are especially hard, predictability helps.</w:t>
+            </w:r>
+          </w:p>
+        </w:tc>
+        <w:tc>
+          <w:tcPr>
+            <w:tcW w:type="dxa" w:w="1380"/>
           </w:tcPr>
           <w:p>
             <w:pPr>
@@ -8672,7 +11089,7 @@
               <w:rPr>
                 <w:sz w:val="19"/>
               </w:rPr>
-              <w:t>Day 9</w:t>
+              <w:t>Day 13</w:t>
             </w:r>
           </w:p>
         </w:tc>
@@ -8683,7 +11100,7 @@
         </w:trPr>
         <w:tc>
           <w:tcPr>
-            <w:tcW w:type="dxa" w:w="2134"/>
+            <w:tcW w:type="dxa" w:w="2125"/>
           </w:tcPr>
           <w:p>
             <w:pPr>
@@ -8694,13 +11111,13 @@
                 <w:b/>
                 <w:sz w:val="19"/>
               </w:rPr>
-              <w:t>Case assumption</w:t>
-            </w:r>
-          </w:p>
-        </w:tc>
-        <w:tc>
-          <w:tcPr>
-            <w:tcW w:type="dxa" w:w="5198"/>
+              <w:t>Badge</w:t>
+            </w:r>
+          </w:p>
+        </w:tc>
+        <w:tc>
+          <w:tcPr>
+            <w:tcW w:type="dxa" w:w="5230"/>
           </w:tcPr>
           <w:p>
             <w:pPr>
@@ -8710,13 +11127,13 @@
               <w:rPr>
                 <w:sz w:val="19"/>
               </w:rPr>
-              <w:t>A fact made up for this exercise to fill a gap in the plan's case. It is marked so you know it is not part of the plan.</w:t>
-            </w:r>
-          </w:p>
-        </w:tc>
-        <w:tc>
-          <w:tcPr>
-            <w:tcW w:type="dxa" w:w="1403"/>
+              <w:t>A small symbol that marks something someone has done; it means something only while it is rare.</w:t>
+            </w:r>
+          </w:p>
+        </w:tc>
+        <w:tc>
+          <w:tcPr>
+            <w:tcW w:type="dxa" w:w="1380"/>
           </w:tcPr>
           <w:p>
             <w:pPr>
@@ -8742,7 +11159,7 @@
               <w:rPr>
                 <w:sz w:val="19"/>
               </w:rPr>
-              <w:t>Day 1</w:t>
+              <w:t>Day 9</w:t>
             </w:r>
           </w:p>
         </w:tc>
@@ -8753,7 +11170,7 @@
         </w:trPr>
         <w:tc>
           <w:tcPr>
-            <w:tcW w:type="dxa" w:w="2134"/>
+            <w:tcW w:type="dxa" w:w="2125"/>
           </w:tcPr>
           <w:p>
             <w:pPr>
@@ -8764,13 +11181,13 @@
                 <w:b/>
                 <w:sz w:val="19"/>
               </w:rPr>
-              <w:t>Chief Experience Officer</w:t>
-            </w:r>
-          </w:p>
-        </w:tc>
-        <w:tc>
-          <w:tcPr>
-            <w:tcW w:type="dxa" w:w="5198"/>
+              <w:t>Body text</w:t>
+            </w:r>
+          </w:p>
+        </w:tc>
+        <w:tc>
+          <w:tcPr>
+            <w:tcW w:type="dxa" w:w="5230"/>
           </w:tcPr>
           <w:p>
             <w:pPr>
@@ -8780,13 +11197,13 @@
               <w:rPr>
                 <w:sz w:val="19"/>
               </w:rPr>
-              <w:t>The manager who is responsible for the experience customers have across all channels, and who decides where the company invests in it.</w:t>
-            </w:r>
-          </w:p>
-        </w:tc>
-        <w:tc>
-          <w:tcPr>
-            <w:tcW w:type="dxa" w:w="1403"/>
+              <w:t>The running text of a page, as opposed to headings, labels and buttons. It carries most of the information and must be the easiest to read.</w:t>
+            </w:r>
+          </w:p>
+        </w:tc>
+        <w:tc>
+          <w:tcPr>
+            <w:tcW w:type="dxa" w:w="1380"/>
           </w:tcPr>
           <w:p>
             <w:pPr>
@@ -8812,7 +11229,7 @@
               <w:rPr>
                 <w:sz w:val="19"/>
               </w:rPr>
-              <w:t>Day 1</w:t>
+              <w:t>Day 3</w:t>
             </w:r>
           </w:p>
         </w:tc>
@@ -8823,7 +11240,7 @@
         </w:trPr>
         <w:tc>
           <w:tcPr>
-            <w:tcW w:type="dxa" w:w="2134"/>
+            <w:tcW w:type="dxa" w:w="2125"/>
           </w:tcPr>
           <w:p>
             <w:pPr>
@@ -8834,13 +11251,13 @@
                 <w:b/>
                 <w:sz w:val="19"/>
               </w:rPr>
-              <w:t>Component</w:t>
-            </w:r>
-          </w:p>
-        </w:tc>
-        <w:tc>
-          <w:tcPr>
-            <w:tcW w:type="dxa" w:w="5198"/>
+              <w:t>Case assumption</w:t>
+            </w:r>
+          </w:p>
+        </w:tc>
+        <w:tc>
+          <w:tcPr>
+            <w:tcW w:type="dxa" w:w="5230"/>
           </w:tcPr>
           <w:p>
             <w:pPr>
@@ -8850,13 +11267,13 @@
               <w:rPr>
                 <w:sz w:val="19"/>
               </w:rPr>
-              <w:t>A reusable building block of an interface, such as a button, a form field or a status label, built once and used on many screens.</w:t>
-            </w:r>
-          </w:p>
-        </w:tc>
-        <w:tc>
-          <w:tcPr>
-            <w:tcW w:type="dxa" w:w="1403"/>
+              <w:t>A fact made up for this exercise to fill a gap in the plan's case. It is marked so you know it is not part of the plan.</w:t>
+            </w:r>
+          </w:p>
+        </w:tc>
+        <w:tc>
+          <w:tcPr>
+            <w:tcW w:type="dxa" w:w="1380"/>
           </w:tcPr>
           <w:p>
             <w:pPr>
@@ -8882,7 +11299,7 @@
               <w:rPr>
                 <w:sz w:val="19"/>
               </w:rPr>
-              <w:t>Day 6</w:t>
+              <w:t>Day 1</w:t>
             </w:r>
           </w:p>
         </w:tc>
@@ -8893,7 +11310,7 @@
         </w:trPr>
         <w:tc>
           <w:tcPr>
-            <w:tcW w:type="dxa" w:w="2134"/>
+            <w:tcW w:type="dxa" w:w="2125"/>
           </w:tcPr>
           <w:p>
             <w:pPr>
@@ -8904,13 +11321,13 @@
                 <w:b/>
                 <w:sz w:val="19"/>
               </w:rPr>
-              <w:t>Consistency</w:t>
-            </w:r>
-          </w:p>
-        </w:tc>
-        <w:tc>
-          <w:tcPr>
-            <w:tcW w:type="dxa" w:w="5198"/>
+              <w:t>Chief Experience Officer</w:t>
+            </w:r>
+          </w:p>
+        </w:tc>
+        <w:tc>
+          <w:tcPr>
+            <w:tcW w:type="dxa" w:w="5230"/>
           </w:tcPr>
           <w:p>
             <w:pPr>
@@ -8920,13 +11337,13 @@
               <w:rPr>
                 <w:sz w:val="19"/>
               </w:rPr>
-              <w:t>The same thing looks, is named and works the same way everywhere, so what people learn on one page holds on the next.</w:t>
-            </w:r>
-          </w:p>
-        </w:tc>
-        <w:tc>
-          <w:tcPr>
-            <w:tcW w:type="dxa" w:w="1403"/>
+              <w:t>The manager who is responsible for the experience customers have across all channels, and who decides where the company invests in it.</w:t>
+            </w:r>
+          </w:p>
+        </w:tc>
+        <w:tc>
+          <w:tcPr>
+            <w:tcW w:type="dxa" w:w="1380"/>
           </w:tcPr>
           <w:p>
             <w:pPr>
@@ -8952,7 +11369,7 @@
               <w:rPr>
                 <w:sz w:val="19"/>
               </w:rPr>
-              <w:t>Day 2</w:t>
+              <w:t>Day 1</w:t>
             </w:r>
           </w:p>
         </w:tc>
@@ -8963,7 +11380,7 @@
         </w:trPr>
         <w:tc>
           <w:tcPr>
-            <w:tcW w:type="dxa" w:w="2134"/>
+            <w:tcW w:type="dxa" w:w="2125"/>
           </w:tcPr>
           <w:p>
             <w:pPr>
@@ -8974,13 +11391,13 @@
                 <w:b/>
                 <w:sz w:val="19"/>
               </w:rPr>
-              <w:t>Contrast</w:t>
-            </w:r>
-          </w:p>
-        </w:tc>
-        <w:tc>
-          <w:tcPr>
-            <w:tcW w:type="dxa" w:w="5198"/>
+              <w:t>Component</w:t>
+            </w:r>
+          </w:p>
+        </w:tc>
+        <w:tc>
+          <w:tcPr>
+            <w:tcW w:type="dxa" w:w="5230"/>
           </w:tcPr>
           <w:p>
             <w:pPr>
@@ -8990,13 +11407,13 @@
               <w:rPr>
                 <w:sz w:val="19"/>
               </w:rPr>
-              <w:t>How much something differs from its surroundings in brightness, colour or size. Strong contrast makes it stand out; too many strong contrasts make everything compete.</w:t>
-            </w:r>
-          </w:p>
-        </w:tc>
-        <w:tc>
-          <w:tcPr>
-            <w:tcW w:type="dxa" w:w="1403"/>
+              <w:t>A reusable building block of an interface, such as a button, a form field or a status label, built once and used on many screens.</w:t>
+            </w:r>
+          </w:p>
+        </w:tc>
+        <w:tc>
+          <w:tcPr>
+            <w:tcW w:type="dxa" w:w="1380"/>
           </w:tcPr>
           <w:p>
             <w:pPr>
@@ -9022,7 +11439,7 @@
               <w:rPr>
                 <w:sz w:val="19"/>
               </w:rPr>
-              <w:t>Day 2</w:t>
+              <w:t>Day 6</w:t>
             </w:r>
           </w:p>
         </w:tc>
@@ -9033,7 +11450,7 @@
         </w:trPr>
         <w:tc>
           <w:tcPr>
-            <w:tcW w:type="dxa" w:w="2134"/>
+            <w:tcW w:type="dxa" w:w="2125"/>
           </w:tcPr>
           <w:p>
             <w:pPr>
@@ -9044,13 +11461,13 @@
                 <w:b/>
                 <w:sz w:val="19"/>
               </w:rPr>
-              <w:t>Design logic</w:t>
-            </w:r>
-          </w:p>
-        </w:tc>
-        <w:tc>
-          <w:tcPr>
-            <w:tcW w:type="dxa" w:w="5198"/>
+              <w:t>Consistency</w:t>
+            </w:r>
+          </w:p>
+        </w:tc>
+        <w:tc>
+          <w:tcPr>
+            <w:tcW w:type="dxa" w:w="5230"/>
           </w:tcPr>
           <w:p>
             <w:pPr>
@@ -9060,13 +11477,13 @@
               <w:rPr>
                 <w:sz w:val="19"/>
               </w:rPr>
-              <w:t>A set of decided rules and shared components, such as which colour means what and which type levels exist, used for every screen so everything stays consistent.</w:t>
-            </w:r>
-          </w:p>
-        </w:tc>
-        <w:tc>
-          <w:tcPr>
-            <w:tcW w:type="dxa" w:w="1403"/>
+              <w:t>The same thing looks, is named and works the same way everywhere, so what people learn on one page holds on the next.</w:t>
+            </w:r>
+          </w:p>
+        </w:tc>
+        <w:tc>
+          <w:tcPr>
+            <w:tcW w:type="dxa" w:w="1380"/>
           </w:tcPr>
           <w:p>
             <w:pPr>
@@ -9092,7 +11509,7 @@
               <w:rPr>
                 <w:sz w:val="19"/>
               </w:rPr>
-              <w:t>Day 3</w:t>
+              <w:t>Day 2</w:t>
             </w:r>
           </w:p>
         </w:tc>
@@ -9103,7 +11520,7 @@
         </w:trPr>
         <w:tc>
           <w:tcPr>
-            <w:tcW w:type="dxa" w:w="2134"/>
+            <w:tcW w:type="dxa" w:w="2125"/>
           </w:tcPr>
           <w:p>
             <w:pPr>
@@ -9114,13 +11531,13 @@
                 <w:b/>
                 <w:sz w:val="19"/>
               </w:rPr>
-              <w:t>Dyslexia</w:t>
-            </w:r>
-          </w:p>
-        </w:tc>
-        <w:tc>
-          <w:tcPr>
-            <w:tcW w:type="dxa" w:w="5198"/>
+              <w:t>Contrast</w:t>
+            </w:r>
+          </w:p>
+        </w:tc>
+        <w:tc>
+          <w:tcPr>
+            <w:tcW w:type="dxa" w:w="5230"/>
           </w:tcPr>
           <w:p>
             <w:pPr>
@@ -9130,13 +11547,13 @@
               <w:rPr>
                 <w:sz w:val="19"/>
               </w:rPr>
-              <w:t>A difference in reading and spelling; dense, justified text, unsuitable typography and complex language are especially hard.</w:t>
-            </w:r>
-          </w:p>
-        </w:tc>
-        <w:tc>
-          <w:tcPr>
-            <w:tcW w:type="dxa" w:w="1403"/>
+              <w:t>How much something differs from its surroundings in brightness, colour or size. Strong contrast makes it stand out; too many strong contrasts make everything compete.</w:t>
+            </w:r>
+          </w:p>
+        </w:tc>
+        <w:tc>
+          <w:tcPr>
+            <w:tcW w:type="dxa" w:w="1380"/>
           </w:tcPr>
           <w:p>
             <w:pPr>
@@ -9162,7 +11579,7 @@
               <w:rPr>
                 <w:sz w:val="19"/>
               </w:rPr>
-              <w:t>Day 13</w:t>
+              <w:t>Day 2</w:t>
             </w:r>
           </w:p>
         </w:tc>
@@ -9173,7 +11590,7 @@
         </w:trPr>
         <w:tc>
           <w:tcPr>
-            <w:tcW w:type="dxa" w:w="2134"/>
+            <w:tcW w:type="dxa" w:w="2125"/>
           </w:tcPr>
           <w:p>
             <w:pPr>
@@ -9184,13 +11601,13 @@
                 <w:b/>
                 <w:sz w:val="19"/>
               </w:rPr>
-              <w:t>Governance</w:t>
-            </w:r>
-          </w:p>
-        </w:tc>
-        <w:tc>
-          <w:tcPr>
-            <w:tcW w:type="dxa" w:w="5198"/>
+              <w:t>Design logic</w:t>
+            </w:r>
+          </w:p>
+        </w:tc>
+        <w:tc>
+          <w:tcPr>
+            <w:tcW w:type="dxa" w:w="5230"/>
           </w:tcPr>
           <w:p>
             <w:pPr>
@@ -9200,13 +11617,13 @@
               <w:rPr>
                 <w:sz w:val="19"/>
               </w:rPr>
-              <w:t>The rules about who may decide what, who is answerable for it and how disagreements are settled.</w:t>
-            </w:r>
-          </w:p>
-        </w:tc>
-        <w:tc>
-          <w:tcPr>
-            <w:tcW w:type="dxa" w:w="1403"/>
+              <w:t>A set of decided rules and shared components, such as which colour means what and which type levels exist, used for every screen so everything stays consistent.</w:t>
+            </w:r>
+          </w:p>
+        </w:tc>
+        <w:tc>
+          <w:tcPr>
+            <w:tcW w:type="dxa" w:w="1380"/>
           </w:tcPr>
           <w:p>
             <w:pPr>
@@ -9232,7 +11649,7 @@
               <w:rPr>
                 <w:sz w:val="19"/>
               </w:rPr>
-              <w:t>Day 1</w:t>
+              <w:t>Day 3</w:t>
             </w:r>
           </w:p>
         </w:tc>
@@ -9243,7 +11660,7 @@
         </w:trPr>
         <w:tc>
           <w:tcPr>
-            <w:tcW w:type="dxa" w:w="2134"/>
+            <w:tcW w:type="dxa" w:w="2125"/>
           </w:tcPr>
           <w:p>
             <w:pPr>
@@ -9254,13 +11671,13 @@
                 <w:b/>
                 <w:sz w:val="19"/>
               </w:rPr>
-              <w:t>Inclusive design</w:t>
-            </w:r>
-          </w:p>
-        </w:tc>
-        <w:tc>
-          <w:tcPr>
-            <w:tcW w:type="dxa" w:w="5198"/>
+              <w:t>Dyslexia</w:t>
+            </w:r>
+          </w:p>
+        </w:tc>
+        <w:tc>
+          <w:tcPr>
+            <w:tcW w:type="dxa" w:w="5230"/>
           </w:tcPr>
           <w:p>
             <w:pPr>
@@ -9270,13 +11687,13 @@
               <w:rPr>
                 <w:sz w:val="19"/>
               </w:rPr>
-              <w:t>Designing with the full range of people from the start, including permanent, temporary and situational limits and different minds.</w:t>
-            </w:r>
-          </w:p>
-        </w:tc>
-        <w:tc>
-          <w:tcPr>
-            <w:tcW w:type="dxa" w:w="1403"/>
+              <w:t>A difference in reading and spelling; dense, justified text, unsuitable typography and complex language are especially hard.</w:t>
+            </w:r>
+          </w:p>
+        </w:tc>
+        <w:tc>
+          <w:tcPr>
+            <w:tcW w:type="dxa" w:w="1380"/>
           </w:tcPr>
           <w:p>
             <w:pPr>
@@ -9302,7 +11719,7 @@
               <w:rPr>
                 <w:sz w:val="19"/>
               </w:rPr>
-              <w:t>Day 12</w:t>
+              <w:t>Day 13</w:t>
             </w:r>
           </w:p>
         </w:tc>
@@ -9313,7 +11730,7 @@
         </w:trPr>
         <w:tc>
           <w:tcPr>
-            <w:tcW w:type="dxa" w:w="2134"/>
+            <w:tcW w:type="dxa" w:w="2125"/>
           </w:tcPr>
           <w:p>
             <w:pPr>
@@ -9324,13 +11741,13 @@
                 <w:b/>
                 <w:sz w:val="19"/>
               </w:rPr>
-              <w:t>Inclusive design pattern</w:t>
-            </w:r>
-          </w:p>
-        </w:tc>
-        <w:tc>
-          <w:tcPr>
-            <w:tcW w:type="dxa" w:w="5198"/>
+              <w:t>Governance</w:t>
+            </w:r>
+          </w:p>
+        </w:tc>
+        <w:tc>
+          <w:tcPr>
+            <w:tcW w:type="dxa" w:w="5230"/>
           </w:tcPr>
           <w:p>
             <w:pPr>
@@ -9340,13 +11757,13 @@
               <w:rPr>
                 <w:sz w:val="19"/>
               </w:rPr>
-              <w:t>A reusable solution that helps several groups at once, such as one task per screen, a step indicator or a summary before sending.</w:t>
-            </w:r>
-          </w:p>
-        </w:tc>
-        <w:tc>
-          <w:tcPr>
-            <w:tcW w:type="dxa" w:w="1403"/>
+              <w:t>The rules about who may decide what, who is answerable for it and how disagreements are settled.</w:t>
+            </w:r>
+          </w:p>
+        </w:tc>
+        <w:tc>
+          <w:tcPr>
+            <w:tcW w:type="dxa" w:w="1380"/>
           </w:tcPr>
           <w:p>
             <w:pPr>
@@ -9372,7 +11789,7 @@
               <w:rPr>
                 <w:sz w:val="19"/>
               </w:rPr>
-              <w:t>Day 13</w:t>
+              <w:t>Day 1</w:t>
             </w:r>
           </w:p>
         </w:tc>
@@ -9383,7 +11800,7 @@
         </w:trPr>
         <w:tc>
           <w:tcPr>
-            <w:tcW w:type="dxa" w:w="2134"/>
+            <w:tcW w:type="dxa" w:w="2125"/>
           </w:tcPr>
           <w:p>
             <w:pPr>
@@ -9394,13 +11811,13 @@
                 <w:b/>
                 <w:sz w:val="19"/>
               </w:rPr>
-              <w:t>Mental model</w:t>
-            </w:r>
-          </w:p>
-        </w:tc>
-        <w:tc>
-          <w:tcPr>
-            <w:tcW w:type="dxa" w:w="5198"/>
+              <w:t>Inclusive design</w:t>
+            </w:r>
+          </w:p>
+        </w:tc>
+        <w:tc>
+          <w:tcPr>
+            <w:tcW w:type="dxa" w:w="5230"/>
           </w:tcPr>
           <w:p>
             <w:pPr>
@@ -9410,13 +11827,13 @@
               <w:rPr>
                 <w:sz w:val="19"/>
               </w:rPr>
-              <w:t>What a person believes a product is and how it works. A design feels natural when it fits that belief and confusing when it does not.</w:t>
-            </w:r>
-          </w:p>
-        </w:tc>
-        <w:tc>
-          <w:tcPr>
-            <w:tcW w:type="dxa" w:w="1403"/>
+              <w:t>Designing with the full range of people from the start, including permanent, temporary and situational limits and different minds.</w:t>
+            </w:r>
+          </w:p>
+        </w:tc>
+        <w:tc>
+          <w:tcPr>
+            <w:tcW w:type="dxa" w:w="1380"/>
           </w:tcPr>
           <w:p>
             <w:pPr>
@@ -9426,7 +11843,7 @@
               <w:rPr>
                 <w:sz w:val="19"/>
               </w:rPr>
-              <w:t>Most people expect a basket icon to show what they have chosen so far.</w:t>
+              <w:t>—</w:t>
             </w:r>
           </w:p>
         </w:tc>
@@ -9442,7 +11859,7 @@
               <w:rPr>
                 <w:sz w:val="19"/>
               </w:rPr>
-              <w:t>Day 1</w:t>
+              <w:t>Day 12</w:t>
             </w:r>
           </w:p>
         </w:tc>
@@ -9453,7 +11870,7 @@
         </w:trPr>
         <w:tc>
           <w:tcPr>
-            <w:tcW w:type="dxa" w:w="2134"/>
+            <w:tcW w:type="dxa" w:w="2125"/>
           </w:tcPr>
           <w:p>
             <w:pPr>
@@ -9464,13 +11881,13 @@
                 <w:b/>
                 <w:sz w:val="19"/>
               </w:rPr>
-              <w:t>Neuro-UX</w:t>
-            </w:r>
-          </w:p>
-        </w:tc>
-        <w:tc>
-          <w:tcPr>
-            <w:tcW w:type="dxa" w:w="5198"/>
+              <w:t>Inclusive design pattern</w:t>
+            </w:r>
+          </w:p>
+        </w:tc>
+        <w:tc>
+          <w:tcPr>
+            <w:tcW w:type="dxa" w:w="5230"/>
           </w:tcPr>
           <w:p>
             <w:pPr>
@@ -9480,13 +11897,13 @@
               <w:rPr>
                 <w:sz w:val="19"/>
               </w:rPr>
-              <w:t>Designing an interface with knowledge of how the brain sees, attends, feels and decides, so that the design steers these processes on purpose and responsibly.</w:t>
-            </w:r>
-          </w:p>
-        </w:tc>
-        <w:tc>
-          <w:tcPr>
-            <w:tcW w:type="dxa" w:w="1403"/>
+              <w:t>A reusable solution that helps several groups at once, such as one task per screen, a step indicator or a summary before sending.</w:t>
+            </w:r>
+          </w:p>
+        </w:tc>
+        <w:tc>
+          <w:tcPr>
+            <w:tcW w:type="dxa" w:w="1380"/>
           </w:tcPr>
           <w:p>
             <w:pPr>
@@ -9512,7 +11929,7 @@
               <w:rPr>
                 <w:sz w:val="19"/>
               </w:rPr>
-              <w:t>Day 1</w:t>
+              <w:t>Day 13</w:t>
             </w:r>
           </w:p>
         </w:tc>
@@ -9523,7 +11940,7 @@
         </w:trPr>
         <w:tc>
           <w:tcPr>
-            <w:tcW w:type="dxa" w:w="2134"/>
+            <w:tcW w:type="dxa" w:w="2125"/>
           </w:tcPr>
           <w:p>
             <w:pPr>
@@ -9534,13 +11951,13 @@
                 <w:b/>
                 <w:sz w:val="19"/>
               </w:rPr>
-              <w:t>Neurodiversity</w:t>
-            </w:r>
-          </w:p>
-        </w:tc>
-        <w:tc>
-          <w:tcPr>
-            <w:tcW w:type="dxa" w:w="5198"/>
+              <w:t>Line spacing</w:t>
+            </w:r>
+          </w:p>
+        </w:tc>
+        <w:tc>
+          <w:tcPr>
+            <w:tcW w:type="dxa" w:w="5230"/>
           </w:tcPr>
           <w:p>
             <w:pPr>
@@ -9550,13 +11967,13 @@
               <w:rPr>
                 <w:sz w:val="19"/>
               </w:rPr>
-              <w:t>The natural variety of human minds, including ADHD, autism and dyslexia; designs that reduce distraction and use plain, predictable language help many of them.</w:t>
-            </w:r>
-          </w:p>
-        </w:tc>
-        <w:tc>
-          <w:tcPr>
-            <w:tcW w:type="dxa" w:w="1403"/>
+              <w:t>The space between lines of text. Too little and lines run together; enough and the eye finds the next line easily.</w:t>
+            </w:r>
+          </w:p>
+        </w:tc>
+        <w:tc>
+          <w:tcPr>
+            <w:tcW w:type="dxa" w:w="1380"/>
           </w:tcPr>
           <w:p>
             <w:pPr>
@@ -9582,7 +11999,7 @@
               <w:rPr>
                 <w:sz w:val="19"/>
               </w:rPr>
-              <w:t>Day 12</w:t>
+              <w:t>Day 3</w:t>
             </w:r>
           </w:p>
         </w:tc>
@@ -9593,7 +12010,7 @@
         </w:trPr>
         <w:tc>
           <w:tcPr>
-            <w:tcW w:type="dxa" w:w="2134"/>
+            <w:tcW w:type="dxa" w:w="2125"/>
           </w:tcPr>
           <w:p>
             <w:pPr>
@@ -9604,13 +12021,13 @@
                 <w:b/>
                 <w:sz w:val="19"/>
               </w:rPr>
-              <w:t>Orientation</w:t>
-            </w:r>
-          </w:p>
-        </w:tc>
-        <w:tc>
-          <w:tcPr>
-            <w:tcW w:type="dxa" w:w="5198"/>
+              <w:t>Mental model</w:t>
+            </w:r>
+          </w:p>
+        </w:tc>
+        <w:tc>
+          <w:tcPr>
+            <w:tcW w:type="dxa" w:w="5230"/>
           </w:tcPr>
           <w:p>
             <w:pPr>
@@ -9620,13 +12037,13 @@
               <w:rPr>
                 <w:sz w:val="19"/>
               </w:rPr>
-              <w:t>Knowing where you are, what you can do here and what happens next.</w:t>
-            </w:r>
-          </w:p>
-        </w:tc>
-        <w:tc>
-          <w:tcPr>
-            <w:tcW w:type="dxa" w:w="1403"/>
+              <w:t>What a person believes a product is and how it works. A design feels natural when it fits that belief and confusing when it does not.</w:t>
+            </w:r>
+          </w:p>
+        </w:tc>
+        <w:tc>
+          <w:tcPr>
+            <w:tcW w:type="dxa" w:w="1380"/>
           </w:tcPr>
           <w:p>
             <w:pPr>
@@ -9636,7 +12053,7 @@
               <w:rPr>
                 <w:sz w:val="19"/>
               </w:rPr>
-              <w:t>—</w:t>
+              <w:t>Most people expect a basket icon to show what they have chosen so far.</w:t>
             </w:r>
           </w:p>
         </w:tc>
@@ -9663,7 +12080,7 @@
         </w:trPr>
         <w:tc>
           <w:tcPr>
-            <w:tcW w:type="dxa" w:w="2134"/>
+            <w:tcW w:type="dxa" w:w="2125"/>
           </w:tcPr>
           <w:p>
             <w:pPr>
@@ -9674,13 +12091,13 @@
                 <w:b/>
                 <w:sz w:val="19"/>
               </w:rPr>
-              <w:t>Overstimulation</w:t>
-            </w:r>
-          </w:p>
-        </w:tc>
-        <w:tc>
-          <w:tcPr>
-            <w:tcW w:type="dxa" w:w="5198"/>
+              <w:t>Neuro-UX</w:t>
+            </w:r>
+          </w:p>
+        </w:tc>
+        <w:tc>
+          <w:tcPr>
+            <w:tcW w:type="dxa" w:w="5230"/>
           </w:tcPr>
           <w:p>
             <w:pPr>
@@ -9690,13 +12107,13 @@
               <w:rPr>
                 <w:sz w:val="19"/>
               </w:rPr>
-              <w:t>Too many signals at once (badges, sounds, pop-ups, counters), so people stop noticing any of them or feel pushed.</w:t>
-            </w:r>
-          </w:p>
-        </w:tc>
-        <w:tc>
-          <w:tcPr>
-            <w:tcW w:type="dxa" w:w="1403"/>
+              <w:t>Designing an interface with knowledge of how the brain sees, attends, feels and decides, so that the design steers these processes on purpose and responsibly.</w:t>
+            </w:r>
+          </w:p>
+        </w:tc>
+        <w:tc>
+          <w:tcPr>
+            <w:tcW w:type="dxa" w:w="1380"/>
           </w:tcPr>
           <w:p>
             <w:pPr>
@@ -9722,7 +12139,7 @@
               <w:rPr>
                 <w:sz w:val="19"/>
               </w:rPr>
-              <w:t>Day 9</w:t>
+              <w:t>Day 1</w:t>
             </w:r>
           </w:p>
         </w:tc>
@@ -9733,7 +12150,7 @@
         </w:trPr>
         <w:tc>
           <w:tcPr>
-            <w:tcW w:type="dxa" w:w="2134"/>
+            <w:tcW w:type="dxa" w:w="2125"/>
           </w:tcPr>
           <w:p>
             <w:pPr>
@@ -9744,13 +12161,13 @@
                 <w:b/>
                 <w:sz w:val="19"/>
               </w:rPr>
-              <w:t>Perceived control</w:t>
-            </w:r>
-          </w:p>
-        </w:tc>
-        <w:tc>
-          <w:tcPr>
-            <w:tcW w:type="dxa" w:w="5198"/>
+              <w:t>Neurodiversity</w:t>
+            </w:r>
+          </w:p>
+        </w:tc>
+        <w:tc>
+          <w:tcPr>
+            <w:tcW w:type="dxa" w:w="5230"/>
           </w:tcPr>
           <w:p>
             <w:pPr>
@@ -9760,13 +12177,13 @@
               <w:rPr>
                 <w:sz w:val="19"/>
               </w:rPr>
-              <w:t>How much people feel they can steer a system; it decides how they feel about automation, even when it differs from the control they really have.</w:t>
-            </w:r>
-          </w:p>
-        </w:tc>
-        <w:tc>
-          <w:tcPr>
-            <w:tcW w:type="dxa" w:w="1403"/>
+              <w:t>The natural variety of human minds, including ADHD, autism and dyslexia; designs that reduce distraction and use plain, predictable language help many of them.</w:t>
+            </w:r>
+          </w:p>
+        </w:tc>
+        <w:tc>
+          <w:tcPr>
+            <w:tcW w:type="dxa" w:w="1380"/>
           </w:tcPr>
           <w:p>
             <w:pPr>
@@ -9792,7 +12209,7 @@
               <w:rPr>
                 <w:sz w:val="19"/>
               </w:rPr>
-              <w:t>Day 10</w:t>
+              <w:t>Day 12</w:t>
             </w:r>
           </w:p>
         </w:tc>
@@ -9803,7 +12220,7 @@
         </w:trPr>
         <w:tc>
           <w:tcPr>
-            <w:tcW w:type="dxa" w:w="2134"/>
+            <w:tcW w:type="dxa" w:w="2125"/>
           </w:tcPr>
           <w:p>
             <w:pPr>
@@ -9814,13 +12231,13 @@
                 <w:b/>
                 <w:sz w:val="19"/>
               </w:rPr>
-              <w:t>Predictability</w:t>
-            </w:r>
-          </w:p>
-        </w:tc>
-        <w:tc>
-          <w:tcPr>
-            <w:tcW w:type="dxa" w:w="5198"/>
+              <w:t>Orientation</w:t>
+            </w:r>
+          </w:p>
+        </w:tc>
+        <w:tc>
+          <w:tcPr>
+            <w:tcW w:type="dxa" w:w="5230"/>
           </w:tcPr>
           <w:p>
             <w:pPr>
@@ -9830,13 +12247,13 @@
               <w:rPr>
                 <w:sz w:val="19"/>
               </w:rPr>
-              <w:t>Being able to tell in advance how something will work, because it works like what you have seen before.</w:t>
-            </w:r>
-          </w:p>
-        </w:tc>
-        <w:tc>
-          <w:tcPr>
-            <w:tcW w:type="dxa" w:w="1403"/>
+              <w:t>Knowing where you are, what you can do here and what happens next.</w:t>
+            </w:r>
+          </w:p>
+        </w:tc>
+        <w:tc>
+          <w:tcPr>
+            <w:tcW w:type="dxa" w:w="1380"/>
           </w:tcPr>
           <w:p>
             <w:pPr>
@@ -9862,7 +12279,7 @@
               <w:rPr>
                 <w:sz w:val="19"/>
               </w:rPr>
-              <w:t>Day 6</w:t>
+              <w:t>Day 1</w:t>
             </w:r>
           </w:p>
         </w:tc>
@@ -9873,7 +12290,7 @@
         </w:trPr>
         <w:tc>
           <w:tcPr>
-            <w:tcW w:type="dxa" w:w="2134"/>
+            <w:tcW w:type="dxa" w:w="2125"/>
           </w:tcPr>
           <w:p>
             <w:pPr>
@@ -9884,13 +12301,13 @@
                 <w:b/>
                 <w:sz w:val="19"/>
               </w:rPr>
-              <w:t>Readability</w:t>
-            </w:r>
-          </w:p>
-        </w:tc>
-        <w:tc>
-          <w:tcPr>
-            <w:tcW w:type="dxa" w:w="5198"/>
+              <w:t>Overstimulation</w:t>
+            </w:r>
+          </w:p>
+        </w:tc>
+        <w:tc>
+          <w:tcPr>
+            <w:tcW w:type="dxa" w:w="5230"/>
           </w:tcPr>
           <w:p>
             <w:pPr>
@@ -9900,13 +12317,13 @@
               <w:rPr>
                 <w:sz w:val="19"/>
               </w:rPr>
-              <w:t>How easily a text can be read and understood: its size, contrast, line length, wording and how it is broken into parts.</w:t>
-            </w:r>
-          </w:p>
-        </w:tc>
-        <w:tc>
-          <w:tcPr>
-            <w:tcW w:type="dxa" w:w="1403"/>
+              <w:t>Too many signals at once (badges, sounds, pop-ups, counters), so people stop noticing any of them or feel pushed.</w:t>
+            </w:r>
+          </w:p>
+        </w:tc>
+        <w:tc>
+          <w:tcPr>
+            <w:tcW w:type="dxa" w:w="1380"/>
           </w:tcPr>
           <w:p>
             <w:pPr>
@@ -9932,7 +12349,7 @@
               <w:rPr>
                 <w:sz w:val="19"/>
               </w:rPr>
-              <w:t>Day 2</w:t>
+              <w:t>Day 9</w:t>
             </w:r>
           </w:p>
         </w:tc>
@@ -9943,7 +12360,7 @@
         </w:trPr>
         <w:tc>
           <w:tcPr>
-            <w:tcW w:type="dxa" w:w="2134"/>
+            <w:tcW w:type="dxa" w:w="2125"/>
           </w:tcPr>
           <w:p>
             <w:pPr>
@@ -9954,13 +12371,13 @@
                 <w:b/>
                 <w:sz w:val="19"/>
               </w:rPr>
-              <w:t>Stakeholder</w:t>
-            </w:r>
-          </w:p>
-        </w:tc>
-        <w:tc>
-          <w:tcPr>
-            <w:tcW w:type="dxa" w:w="5198"/>
+              <w:t>Perceived control</w:t>
+            </w:r>
+          </w:p>
+        </w:tc>
+        <w:tc>
+          <w:tcPr>
+            <w:tcW w:type="dxa" w:w="5230"/>
           </w:tcPr>
           <w:p>
             <w:pPr>
@@ -9970,13 +12387,13 @@
               <w:rPr>
                 <w:sz w:val="19"/>
               </w:rPr>
-              <w:t>A person or department with an interest in a decision, such as marketing, compliance, IT or sales.</w:t>
-            </w:r>
-          </w:p>
-        </w:tc>
-        <w:tc>
-          <w:tcPr>
-            <w:tcW w:type="dxa" w:w="1403"/>
+              <w:t>How much people feel they can steer a system; it decides how they feel about automation, even when it differs from the control they really have.</w:t>
+            </w:r>
+          </w:p>
+        </w:tc>
+        <w:tc>
+          <w:tcPr>
+            <w:tcW w:type="dxa" w:w="1380"/>
           </w:tcPr>
           <w:p>
             <w:pPr>
@@ -10002,7 +12419,7 @@
               <w:rPr>
                 <w:sz w:val="19"/>
               </w:rPr>
-              <w:t>Day 1</w:t>
+              <w:t>Day 10</w:t>
             </w:r>
           </w:p>
         </w:tc>
@@ -10013,7 +12430,7 @@
         </w:trPr>
         <w:tc>
           <w:tcPr>
-            <w:tcW w:type="dxa" w:w="2134"/>
+            <w:tcW w:type="dxa" w:w="2125"/>
           </w:tcPr>
           <w:p>
             <w:pPr>
@@ -10024,13 +12441,13 @@
                 <w:b/>
                 <w:sz w:val="19"/>
               </w:rPr>
-              <w:t>Stimulus load</w:t>
-            </w:r>
-          </w:p>
-        </w:tc>
-        <w:tc>
-          <w:tcPr>
-            <w:tcW w:type="dxa" w:w="5198"/>
+              <w:t>Predictability</w:t>
+            </w:r>
+          </w:p>
+        </w:tc>
+        <w:tc>
+          <w:tcPr>
+            <w:tcW w:type="dxa" w:w="5230"/>
           </w:tcPr>
           <w:p>
             <w:pPr>
@@ -10040,13 +12457,13 @@
               <w:rPr>
                 <w:sz w:val="19"/>
               </w:rPr>
-              <w:t>How much competes for attention at once (colours, banners, movement, notifications); too much tires, distracts or overwhelms.</w:t>
-            </w:r>
-          </w:p>
-        </w:tc>
-        <w:tc>
-          <w:tcPr>
-            <w:tcW w:type="dxa" w:w="1403"/>
+              <w:t>Being able to tell in advance how something will work, because it works like what you have seen before.</w:t>
+            </w:r>
+          </w:p>
+        </w:tc>
+        <w:tc>
+          <w:tcPr>
+            <w:tcW w:type="dxa" w:w="1380"/>
           </w:tcPr>
           <w:p>
             <w:pPr>
@@ -10072,7 +12489,7 @@
               <w:rPr>
                 <w:sz w:val="19"/>
               </w:rPr>
-              <w:t>Day 13</w:t>
+              <w:t>Day 6</w:t>
             </w:r>
           </w:p>
         </w:tc>
@@ -10083,7 +12500,7 @@
         </w:trPr>
         <w:tc>
           <w:tcPr>
-            <w:tcW w:type="dxa" w:w="2134"/>
+            <w:tcW w:type="dxa" w:w="2125"/>
           </w:tcPr>
           <w:p>
             <w:pPr>
@@ -10094,13 +12511,13 @@
                 <w:b/>
                 <w:sz w:val="19"/>
               </w:rPr>
-              <w:t>Stimulus reduction</w:t>
-            </w:r>
-          </w:p>
-        </w:tc>
-        <w:tc>
-          <w:tcPr>
-            <w:tcW w:type="dxa" w:w="5198"/>
+              <w:t>Readability</w:t>
+            </w:r>
+          </w:p>
+        </w:tc>
+        <w:tc>
+          <w:tcPr>
+            <w:tcW w:type="dxa" w:w="5230"/>
           </w:tcPr>
           <w:p>
             <w:pPr>
@@ -10110,13 +12527,13 @@
               <w:rPr>
                 <w:sz w:val="19"/>
               </w:rPr>
-              <w:t>Showing or saying fewer things at once, so the mind can attend to what matters.</w:t>
-            </w:r>
-          </w:p>
-        </w:tc>
-        <w:tc>
-          <w:tcPr>
-            <w:tcW w:type="dxa" w:w="1403"/>
+              <w:t>How easily a text can be read and understood: its size, contrast, line length, wording and how it is broken into parts.</w:t>
+            </w:r>
+          </w:p>
+        </w:tc>
+        <w:tc>
+          <w:tcPr>
+            <w:tcW w:type="dxa" w:w="1380"/>
           </w:tcPr>
           <w:p>
             <w:pPr>
@@ -10142,7 +12559,7 @@
               <w:rPr>
                 <w:sz w:val="19"/>
               </w:rPr>
-              <w:t>Day 11</w:t>
+              <w:t>Day 2</w:t>
             </w:r>
           </w:p>
         </w:tc>
@@ -10153,7 +12570,7 @@
         </w:trPr>
         <w:tc>
           <w:tcPr>
-            <w:tcW w:type="dxa" w:w="2134"/>
+            <w:tcW w:type="dxa" w:w="2125"/>
           </w:tcPr>
           <w:p>
             <w:pPr>
@@ -10164,13 +12581,13 @@
                 <w:b/>
                 <w:sz w:val="19"/>
               </w:rPr>
-              <w:t>Typography</w:t>
-            </w:r>
-          </w:p>
-        </w:tc>
-        <w:tc>
-          <w:tcPr>
-            <w:tcW w:type="dxa" w:w="5198"/>
+              <w:t>Stakeholder</w:t>
+            </w:r>
+          </w:p>
+        </w:tc>
+        <w:tc>
+          <w:tcPr>
+            <w:tcW w:type="dxa" w:w="5230"/>
           </w:tcPr>
           <w:p>
             <w:pPr>
@@ -10180,13 +12597,13 @@
               <w:rPr>
                 <w:sz w:val="19"/>
               </w:rPr>
-              <w:t>How text is set: which typeface, which size, weight, line spacing and line length, and how the text is broken into levels and parts.</w:t>
-            </w:r>
-          </w:p>
-        </w:tc>
-        <w:tc>
-          <w:tcPr>
-            <w:tcW w:type="dxa" w:w="1403"/>
+              <w:t>A person or department with an interest in a decision, such as marketing, compliance, IT or sales.</w:t>
+            </w:r>
+          </w:p>
+        </w:tc>
+        <w:tc>
+          <w:tcPr>
+            <w:tcW w:type="dxa" w:w="1380"/>
           </w:tcPr>
           <w:p>
             <w:pPr>
@@ -10212,7 +12629,7 @@
               <w:rPr>
                 <w:sz w:val="19"/>
               </w:rPr>
-              <w:t>Day 3</w:t>
+              <w:t>Day 1</w:t>
             </w:r>
           </w:p>
         </w:tc>
@@ -10223,7 +12640,7 @@
         </w:trPr>
         <w:tc>
           <w:tcPr>
-            <w:tcW w:type="dxa" w:w="2134"/>
+            <w:tcW w:type="dxa" w:w="2125"/>
           </w:tcPr>
           <w:p>
             <w:pPr>
@@ -10234,13 +12651,223 @@
                 <w:b/>
                 <w:sz w:val="19"/>
               </w:rPr>
+              <w:t>Stimulus load</w:t>
+            </w:r>
+          </w:p>
+        </w:tc>
+        <w:tc>
+          <w:tcPr>
+            <w:tcW w:type="dxa" w:w="5230"/>
+          </w:tcPr>
+          <w:p>
+            <w:pPr>
+              <w:spacing w:before="0" w:after="0"/>
+            </w:pPr>
+            <w:r>
+              <w:rPr>
+                <w:sz w:val="19"/>
+              </w:rPr>
+              <w:t>How much competes for attention at once (colours, banners, movement, notifications); too much tires, distracts or overwhelms.</w:t>
+            </w:r>
+          </w:p>
+        </w:tc>
+        <w:tc>
+          <w:tcPr>
+            <w:tcW w:type="dxa" w:w="1380"/>
+          </w:tcPr>
+          <w:p>
+            <w:pPr>
+              <w:spacing w:before="0" w:after="0"/>
+            </w:pPr>
+            <w:r>
+              <w:rPr>
+                <w:sz w:val="19"/>
+              </w:rPr>
+              <w:t>—</w:t>
+            </w:r>
+          </w:p>
+        </w:tc>
+        <w:tc>
+          <w:tcPr>
+            <w:tcW w:type="dxa" w:w="903"/>
+          </w:tcPr>
+          <w:p>
+            <w:pPr>
+              <w:spacing w:before="0" w:after="0"/>
+            </w:pPr>
+            <w:r>
+              <w:rPr>
+                <w:sz w:val="19"/>
+              </w:rPr>
+              <w:t>Day 13</w:t>
+            </w:r>
+          </w:p>
+        </w:tc>
+      </w:tr>
+      <w:tr>
+        <w:trPr>
+          <w:cantSplit/>
+        </w:trPr>
+        <w:tc>
+          <w:tcPr>
+            <w:tcW w:type="dxa" w:w="2125"/>
+          </w:tcPr>
+          <w:p>
+            <w:pPr>
+              <w:spacing w:before="0" w:after="0"/>
+            </w:pPr>
+            <w:r>
+              <w:rPr>
+                <w:b/>
+                <w:sz w:val="19"/>
+              </w:rPr>
+              <w:t>Stimulus reduction</w:t>
+            </w:r>
+          </w:p>
+        </w:tc>
+        <w:tc>
+          <w:tcPr>
+            <w:tcW w:type="dxa" w:w="5230"/>
+          </w:tcPr>
+          <w:p>
+            <w:pPr>
+              <w:spacing w:before="0" w:after="0"/>
+            </w:pPr>
+            <w:r>
+              <w:rPr>
+                <w:sz w:val="19"/>
+              </w:rPr>
+              <w:t>Showing or saying fewer things at once, so the mind can attend to what matters.</w:t>
+            </w:r>
+          </w:p>
+        </w:tc>
+        <w:tc>
+          <w:tcPr>
+            <w:tcW w:type="dxa" w:w="1380"/>
+          </w:tcPr>
+          <w:p>
+            <w:pPr>
+              <w:spacing w:before="0" w:after="0"/>
+            </w:pPr>
+            <w:r>
+              <w:rPr>
+                <w:sz w:val="19"/>
+              </w:rPr>
+              <w:t>—</w:t>
+            </w:r>
+          </w:p>
+        </w:tc>
+        <w:tc>
+          <w:tcPr>
+            <w:tcW w:type="dxa" w:w="903"/>
+          </w:tcPr>
+          <w:p>
+            <w:pPr>
+              <w:spacing w:before="0" w:after="0"/>
+            </w:pPr>
+            <w:r>
+              <w:rPr>
+                <w:sz w:val="19"/>
+              </w:rPr>
+              <w:t>Day 11</w:t>
+            </w:r>
+          </w:p>
+        </w:tc>
+      </w:tr>
+      <w:tr>
+        <w:trPr>
+          <w:cantSplit/>
+        </w:trPr>
+        <w:tc>
+          <w:tcPr>
+            <w:tcW w:type="dxa" w:w="2125"/>
+          </w:tcPr>
+          <w:p>
+            <w:pPr>
+              <w:spacing w:before="0" w:after="0"/>
+            </w:pPr>
+            <w:r>
+              <w:rPr>
+                <w:b/>
+                <w:sz w:val="19"/>
+              </w:rPr>
+              <w:t>Typography</w:t>
+            </w:r>
+          </w:p>
+        </w:tc>
+        <w:tc>
+          <w:tcPr>
+            <w:tcW w:type="dxa" w:w="5230"/>
+          </w:tcPr>
+          <w:p>
+            <w:pPr>
+              <w:spacing w:before="0" w:after="0"/>
+            </w:pPr>
+            <w:r>
+              <w:rPr>
+                <w:sz w:val="19"/>
+              </w:rPr>
+              <w:t>How text is set: which typeface, which size, weight, line spacing and line length, and how the text is broken into levels and parts.</w:t>
+            </w:r>
+          </w:p>
+        </w:tc>
+        <w:tc>
+          <w:tcPr>
+            <w:tcW w:type="dxa" w:w="1380"/>
+          </w:tcPr>
+          <w:p>
+            <w:pPr>
+              <w:spacing w:before="0" w:after="0"/>
+            </w:pPr>
+            <w:r>
+              <w:rPr>
+                <w:sz w:val="19"/>
+              </w:rPr>
+              <w:t>—</w:t>
+            </w:r>
+          </w:p>
+        </w:tc>
+        <w:tc>
+          <w:tcPr>
+            <w:tcW w:type="dxa" w:w="903"/>
+          </w:tcPr>
+          <w:p>
+            <w:pPr>
+              <w:spacing w:before="0" w:after="0"/>
+            </w:pPr>
+            <w:r>
+              <w:rPr>
+                <w:sz w:val="19"/>
+              </w:rPr>
+              <w:t>Day 3</w:t>
+            </w:r>
+          </w:p>
+        </w:tc>
+      </w:tr>
+      <w:tr>
+        <w:trPr>
+          <w:cantSplit/>
+        </w:trPr>
+        <w:tc>
+          <w:tcPr>
+            <w:tcW w:type="dxa" w:w="2125"/>
+          </w:tcPr>
+          <w:p>
+            <w:pPr>
+              <w:spacing w:before="0" w:after="0"/>
+            </w:pPr>
+            <w:r>
+              <w:rPr>
+                <w:b/>
+                <w:sz w:val="19"/>
+              </w:rPr>
               <w:t>UX (user experience)</w:t>
             </w:r>
           </w:p>
         </w:tc>
         <w:tc>
           <w:tcPr>
-            <w:tcW w:type="dxa" w:w="5198"/>
+            <w:tcW w:type="dxa" w:w="5230"/>
           </w:tcPr>
           <w:p>
             <w:pPr>
@@ -10256,7 +12883,7 @@
         </w:tc>
         <w:tc>
           <w:tcPr>
-            <w:tcW w:type="dxa" w:w="1403"/>
+            <w:tcW w:type="dxa" w:w="1380"/>
           </w:tcPr>
           <w:p>
             <w:pPr>
@@ -10283,6 +12910,76 @@
                 <w:sz w:val="19"/>
               </w:rPr>
               <w:t>Day 1</w:t>
+            </w:r>
+          </w:p>
+        </w:tc>
+      </w:tr>
+      <w:tr>
+        <w:trPr>
+          <w:cantSplit/>
+        </w:trPr>
+        <w:tc>
+          <w:tcPr>
+            <w:tcW w:type="dxa" w:w="2125"/>
+          </w:tcPr>
+          <w:p>
+            <w:pPr>
+              <w:spacing w:before="0" w:after="0"/>
+            </w:pPr>
+            <w:r>
+              <w:rPr>
+                <w:b/>
+                <w:sz w:val="19"/>
+              </w:rPr>
+              <w:t>WCAG</w:t>
+            </w:r>
+          </w:p>
+        </w:tc>
+        <w:tc>
+          <w:tcPr>
+            <w:tcW w:type="dxa" w:w="5230"/>
+          </w:tcPr>
+          <w:p>
+            <w:pPr>
+              <w:spacing w:before="0" w:after="0"/>
+            </w:pPr>
+            <w:r>
+              <w:rPr>
+                <w:sz w:val="19"/>
+              </w:rPr>
+              <w:t>The Web Content Accessibility Guidelines: the international standard for accessible web content, with levels A, AA and AAA; AA is the usual target.</w:t>
+            </w:r>
+          </w:p>
+        </w:tc>
+        <w:tc>
+          <w:tcPr>
+            <w:tcW w:type="dxa" w:w="1380"/>
+          </w:tcPr>
+          <w:p>
+            <w:pPr>
+              <w:spacing w:before="0" w:after="0"/>
+            </w:pPr>
+            <w:r>
+              <w:rPr>
+                <w:sz w:val="19"/>
+              </w:rPr>
+              <w:t>—</w:t>
+            </w:r>
+          </w:p>
+        </w:tc>
+        <w:tc>
+          <w:tcPr>
+            <w:tcW w:type="dxa" w:w="903"/>
+          </w:tcPr>
+          <w:p>
+            <w:pPr>
+              <w:spacing w:before="0" w:after="0"/>
+            </w:pPr>
+            <w:r>
+              <w:rPr>
+                <w:sz w:val="19"/>
+              </w:rPr>
+              <w:t>Day 12</w:t>
             </w:r>
           </w:p>
         </w:tc>

</xml_diff>